<commit_message>
Refactor code structure and remove redundant functions for improved readability and maintainability
</commit_message>
<xml_diff>
--- a/Proje2-Yedekleme-Kurtarma/Proje2-Yedekleme-Kurtarma.docx
+++ b/Proje2-Yedekleme-Kurtarma/Proje2-Yedekleme-Kurtarma.docx
@@ -14,27 +14,7 @@
           <w:sz w:val="36"/>
           <w:szCs w:val="36"/>
         </w:rPr>
-        <w:t xml:space="preserve">Proje 2 — </w:t>
-      </w:r>
-      <w:proofErr w:type="spellStart"/>
-      <w:r>
-        <w:rPr>
-          <w:b/>
-          <w:bCs/>
-          <w:sz w:val="36"/>
-          <w:szCs w:val="36"/>
-        </w:rPr>
-        <w:t>Veritabanı</w:t>
-      </w:r>
-      <w:proofErr w:type="spellEnd"/>
-      <w:r>
-        <w:rPr>
-          <w:b/>
-          <w:bCs/>
-          <w:sz w:val="36"/>
-          <w:szCs w:val="36"/>
-        </w:rPr>
-        <w:t xml:space="preserve"> Yedekleme ve Felaketten Kurtarma Planı</w:t>
+        <w:t>Proje 2 — Veritabanı Yedekleme ve Felaketten Kurtarma Planı</w:t>
       </w:r>
     </w:p>
     <w:p>
@@ -57,6 +37,13 @@
       <w:r>
         <w:t xml:space="preserve"> 22290528</w:t>
       </w:r>
+      <w:r>
+        <w:br/>
+        <w:t>Github:</w:t>
+      </w:r>
+      <w:r>
+        <w:t xml:space="preserve"> https://github.com/bycycomr/BLM4522</w:t>
+      </w:r>
     </w:p>
     <w:p>
       <w:pPr>
@@ -73,23 +60,7 @@
         <w:jc w:val="center"/>
       </w:pPr>
       <w:r>
-        <w:t xml:space="preserve">Örnek </w:t>
-      </w:r>
-      <w:proofErr w:type="spellStart"/>
-      <w:r>
-        <w:t>Veritabanı</w:t>
-      </w:r>
-      <w:proofErr w:type="spellEnd"/>
-      <w:r>
-        <w:t xml:space="preserve">: </w:t>
-      </w:r>
-      <w:proofErr w:type="spellStart"/>
-      <w:r>
-        <w:t>OkulDB</w:t>
-      </w:r>
-      <w:proofErr w:type="spellEnd"/>
-      <w:r>
-        <w:t xml:space="preserve"> (proje kapsamında oluşturulmuştur)</w:t>
+        <w:t>Örnek Veritabanı: OkulDB (proje kapsamında oluşturulmuştur)</w:t>
       </w:r>
     </w:p>
     <w:p>
@@ -104,13 +75,8 @@
       <w:pPr>
         <w:spacing w:before="60" w:after="80"/>
       </w:pPr>
-      <w:proofErr w:type="spellStart"/>
-      <w:r>
-        <w:t>Veritabanları</w:t>
-      </w:r>
-      <w:proofErr w:type="spellEnd"/>
-      <w:r>
-        <w:t>, bir kurumun en kritik bilgi varlığıdır. Donanım arızası, insan hatası (yanlışlıkla silme), yazılım hatası, ya da siber saldırı gibi sebeplerle veri kaybı yaşanabilir. Bu projenin amacı:</w:t>
+      <w:r>
+        <w:t>Veritabanları, bir kurumun en kritik bilgi varlığıdır. Donanım arızası, insan hatası (yanlışlıkla silme), yazılım hatası, ya da siber saldırı gibi sebeplerle veri kaybı yaşanabilir. Bu projenin amacı:</w:t>
       </w:r>
     </w:p>
     <w:p>
@@ -123,23 +89,7 @@
         <w:spacing w:before="40" w:after="40"/>
       </w:pPr>
       <w:r>
-        <w:t xml:space="preserve">SQL Server'ın yedekleme mekanizmalarını (Full, </w:t>
-      </w:r>
-      <w:proofErr w:type="spellStart"/>
-      <w:r>
-        <w:t>Differential</w:t>
-      </w:r>
-      <w:proofErr w:type="spellEnd"/>
-      <w:r>
-        <w:t xml:space="preserve">, </w:t>
-      </w:r>
-      <w:proofErr w:type="spellStart"/>
-      <w:r>
-        <w:t>Transaction</w:t>
-      </w:r>
-      <w:proofErr w:type="spellEnd"/>
-      <w:r>
-        <w:t xml:space="preserve"> Log) uygulamalı olarak öğrenmek.</w:t>
+        <w:t>SQL Server'ın yedekleme mekanizmalarını (Full, Differential, Transaction Log) uygulamalı olarak öğrenmek.</w:t>
       </w:r>
     </w:p>
     <w:p>
@@ -152,15 +102,7 @@
         <w:spacing w:before="40" w:after="40"/>
       </w:pPr>
       <w:r>
-        <w:t xml:space="preserve">Farklı kurtarma senaryolarında (tam geri yükleme, </w:t>
-      </w:r>
-      <w:proofErr w:type="spellStart"/>
-      <w:r>
-        <w:t>point</w:t>
-      </w:r>
-      <w:proofErr w:type="spellEnd"/>
-      <w:r>
-        <w:t>-in-time restore, yanlışlıkla silme) kayıp veriyi geri getirmek.</w:t>
+        <w:t>Farklı kurtarma senaryolarında (tam geri yükleme, point-in-time restore, yanlışlıkla silme) kayıp veriyi geri getirmek.</w:t>
       </w:r>
     </w:p>
     <w:p>
@@ -395,21 +337,12 @@
             </w:tcMar>
           </w:tcPr>
           <w:p>
-            <w:proofErr w:type="spellStart"/>
             <w:r>
               <w:rPr>
                 <w:sz w:val="20"/>
                 <w:szCs w:val="20"/>
               </w:rPr>
-              <w:t>Veritabanının</w:t>
-            </w:r>
-            <w:proofErr w:type="spellEnd"/>
-            <w:r>
-              <w:rPr>
-                <w:sz w:val="20"/>
-                <w:szCs w:val="20"/>
-              </w:rPr>
-              <w:t xml:space="preserve"> tamamı</w:t>
+              <w:t>Veritabanının tamamı</w:t>
             </w:r>
           </w:p>
         </w:tc>
@@ -484,21 +417,12 @@
             </w:tcMar>
           </w:tcPr>
           <w:p>
-            <w:proofErr w:type="spellStart"/>
             <w:r>
               <w:rPr>
                 <w:sz w:val="20"/>
                 <w:szCs w:val="20"/>
               </w:rPr>
-              <w:t>Differential</w:t>
-            </w:r>
-            <w:proofErr w:type="spellEnd"/>
-            <w:r>
-              <w:rPr>
-                <w:sz w:val="20"/>
-                <w:szCs w:val="20"/>
-              </w:rPr>
-              <w:t xml:space="preserve"> (Fark)</w:t>
+              <w:t>Differential (Fark)</w:t>
             </w:r>
           </w:p>
         </w:tc>
@@ -524,23 +448,7 @@
                 <w:sz w:val="20"/>
                 <w:szCs w:val="20"/>
               </w:rPr>
-              <w:t xml:space="preserve">Son </w:t>
-            </w:r>
-            <w:proofErr w:type="spellStart"/>
-            <w:r>
-              <w:rPr>
-                <w:sz w:val="20"/>
-                <w:szCs w:val="20"/>
-              </w:rPr>
-              <w:t>FULL'dan</w:t>
-            </w:r>
-            <w:proofErr w:type="spellEnd"/>
-            <w:r>
-              <w:rPr>
-                <w:sz w:val="20"/>
-                <w:szCs w:val="20"/>
-              </w:rPr>
-              <w:t xml:space="preserve"> bu yana değişenler</w:t>
+              <w:t>Son FULL'dan bu yana değişenler</w:t>
             </w:r>
           </w:p>
         </w:tc>
@@ -615,21 +523,12 @@
             </w:tcMar>
           </w:tcPr>
           <w:p>
-            <w:proofErr w:type="spellStart"/>
             <w:r>
               <w:rPr>
                 <w:sz w:val="20"/>
                 <w:szCs w:val="20"/>
               </w:rPr>
-              <w:t>Transaction</w:t>
-            </w:r>
-            <w:proofErr w:type="spellEnd"/>
-            <w:r>
-              <w:rPr>
-                <w:sz w:val="20"/>
-                <w:szCs w:val="20"/>
-              </w:rPr>
-              <w:t xml:space="preserve"> Log</w:t>
+              <w:t>Transaction Log</w:t>
             </w:r>
           </w:p>
         </w:tc>
@@ -723,15 +622,7 @@
         <w:pStyle w:val="Balk2"/>
       </w:pPr>
       <w:r>
-        <w:t xml:space="preserve">2.2 </w:t>
-      </w:r>
-      <w:proofErr w:type="spellStart"/>
-      <w:r>
-        <w:t>Recovery</w:t>
-      </w:r>
-      <w:proofErr w:type="spellEnd"/>
-      <w:r>
-        <w:t xml:space="preserve"> Model</w:t>
+        <w:t>2.2 Recovery Model</w:t>
       </w:r>
     </w:p>
     <w:p>
@@ -846,19 +737,8 @@
                 <w:sz w:val="20"/>
                 <w:szCs w:val="20"/>
               </w:rPr>
-              <w:t xml:space="preserve">Log </w:t>
+              <w:t>Log Backup</w:t>
             </w:r>
-            <w:proofErr w:type="spellStart"/>
-            <w:r>
-              <w:rPr>
-                <w:b/>
-                <w:bCs/>
-                <w:sz w:val="20"/>
-                <w:szCs w:val="20"/>
-              </w:rPr>
-              <w:t>Backup</w:t>
-            </w:r>
-            <w:proofErr w:type="spellEnd"/>
           </w:p>
         </w:tc>
         <w:tc>
@@ -935,31 +815,13 @@
             </w:tcMar>
           </w:tcPr>
           <w:p>
-            <w:proofErr w:type="spellStart"/>
             <w:r>
               <w:rPr>
                 <w:sz w:val="20"/>
                 <w:szCs w:val="20"/>
               </w:rPr>
-              <w:t>Checkpoint'te</w:t>
+              <w:t>Checkpoint'te truncate</w:t>
             </w:r>
-            <w:proofErr w:type="spellEnd"/>
-            <w:r>
-              <w:rPr>
-                <w:sz w:val="20"/>
-                <w:szCs w:val="20"/>
-              </w:rPr>
-              <w:t xml:space="preserve"> </w:t>
-            </w:r>
-            <w:proofErr w:type="spellStart"/>
-            <w:r>
-              <w:rPr>
-                <w:sz w:val="20"/>
-                <w:szCs w:val="20"/>
-              </w:rPr>
-              <w:t>truncate</w:t>
-            </w:r>
-            <w:proofErr w:type="spellEnd"/>
           </w:p>
         </w:tc>
         <w:tc>
@@ -1064,23 +926,7 @@
                 <w:sz w:val="20"/>
                 <w:szCs w:val="20"/>
               </w:rPr>
-              <w:t xml:space="preserve">Log </w:t>
-            </w:r>
-            <w:proofErr w:type="spellStart"/>
-            <w:r>
-              <w:rPr>
-                <w:sz w:val="20"/>
-                <w:szCs w:val="20"/>
-              </w:rPr>
-              <w:t>backup'a</w:t>
-            </w:r>
-            <w:proofErr w:type="spellEnd"/>
-            <w:r>
-              <w:rPr>
-                <w:sz w:val="20"/>
-                <w:szCs w:val="20"/>
-              </w:rPr>
-              <w:t xml:space="preserve"> kadar tutulur</w:t>
+              <w:t>Log backup'a kadar tutulur</w:t>
             </w:r>
           </w:p>
         </w:tc>
@@ -1186,39 +1032,7 @@
                 <w:sz w:val="20"/>
                 <w:szCs w:val="20"/>
               </w:rPr>
-              <w:t xml:space="preserve">Çoğunlukla FULL, </w:t>
-            </w:r>
-            <w:proofErr w:type="spellStart"/>
-            <w:r>
-              <w:rPr>
-                <w:sz w:val="20"/>
-                <w:szCs w:val="20"/>
-              </w:rPr>
-              <w:t>bulk</w:t>
-            </w:r>
-            <w:proofErr w:type="spellEnd"/>
-            <w:r>
-              <w:rPr>
-                <w:sz w:val="20"/>
-                <w:szCs w:val="20"/>
-              </w:rPr>
-              <w:t xml:space="preserve"> </w:t>
-            </w:r>
-            <w:proofErr w:type="spellStart"/>
-            <w:r>
-              <w:rPr>
-                <w:sz w:val="20"/>
-                <w:szCs w:val="20"/>
-              </w:rPr>
-              <w:t>op'larda</w:t>
-            </w:r>
-            <w:proofErr w:type="spellEnd"/>
-            <w:r>
-              <w:rPr>
-                <w:sz w:val="20"/>
-                <w:szCs w:val="20"/>
-              </w:rPr>
-              <w:t xml:space="preserve"> minimal</w:t>
+              <w:t>Çoğunlukla FULL, bulk op'larda minimal</w:t>
             </w:r>
           </w:p>
         </w:tc>
@@ -1294,15 +1108,7 @@
         <w:pStyle w:val="Balk2"/>
       </w:pPr>
       <w:r>
-        <w:t xml:space="preserve">2.3 Database </w:t>
-      </w:r>
-      <w:proofErr w:type="spellStart"/>
-      <w:r>
-        <w:t>Mirroring</w:t>
-      </w:r>
-      <w:proofErr w:type="spellEnd"/>
-      <w:r>
-        <w:t xml:space="preserve"> (Kısa Değini)</w:t>
+        <w:t>2.3 Database Mirroring (Kısa Değini)</w:t>
       </w:r>
     </w:p>
     <w:p>
@@ -1310,75 +1116,11 @@
         <w:spacing w:before="60" w:after="80"/>
       </w:pPr>
       <w:r>
-        <w:t xml:space="preserve">Database </w:t>
-      </w:r>
-      <w:proofErr w:type="spellStart"/>
-      <w:r>
-        <w:t>Mirroring</w:t>
-      </w:r>
-      <w:proofErr w:type="spellEnd"/>
-      <w:r>
-        <w:t xml:space="preserve">, bir </w:t>
-      </w:r>
-      <w:proofErr w:type="spellStart"/>
-      <w:r>
-        <w:t>veritabanının</w:t>
-      </w:r>
-      <w:proofErr w:type="spellEnd"/>
-      <w:r>
-        <w:t xml:space="preserve"> 'asıl (</w:t>
-      </w:r>
-      <w:proofErr w:type="spellStart"/>
-      <w:r>
-        <w:t>principal</w:t>
-      </w:r>
-      <w:proofErr w:type="spellEnd"/>
-      <w:r>
-        <w:t>)' ve 'yansıtıcı (</w:t>
-      </w:r>
-      <w:proofErr w:type="spellStart"/>
-      <w:r>
-        <w:t>mirror</w:t>
-      </w:r>
-      <w:proofErr w:type="spellEnd"/>
-      <w:r>
-        <w:t xml:space="preserve">)' kopyalarını eş zamanlı tutarak yüksek erişilebilirlik sağlar. Microsoft artık bu özelliği </w:t>
-      </w:r>
-      <w:proofErr w:type="spellStart"/>
-      <w:r>
-        <w:t>Always</w:t>
-      </w:r>
-      <w:proofErr w:type="spellEnd"/>
-      <w:r>
-        <w:t xml:space="preserve"> On </w:t>
-      </w:r>
-      <w:proofErr w:type="spellStart"/>
-      <w:r>
-        <w:t>Availability</w:t>
-      </w:r>
-      <w:proofErr w:type="spellEnd"/>
-      <w:r>
-        <w:t xml:space="preserve"> </w:t>
-      </w:r>
-      <w:proofErr w:type="spellStart"/>
-      <w:r>
-        <w:t>Groups</w:t>
-      </w:r>
-      <w:proofErr w:type="spellEnd"/>
-      <w:r>
-        <w:t xml:space="preserve"> ile değiştirmiş olsa </w:t>
-      </w:r>
-      <w:proofErr w:type="gramStart"/>
-      <w:r>
-        <w:t>da,</w:t>
-      </w:r>
-      <w:proofErr w:type="gramEnd"/>
-      <w:r>
-        <w:t xml:space="preserve"> felaket kurtarma stratejisinde konsept olarak hâlâ önemlidir. </w:t>
+        <w:t xml:space="preserve">Database Mirroring, bir veritabanının 'asıl (principal)' ve 'yansıtıcı (mirror)' kopyalarını eş zamanlı tutarak yüksek erişilebilirlik sağlar. Microsoft artık bu özelliği Always On Availability </w:t>
       </w:r>
       <w:r>
         <w:lastRenderedPageBreak/>
-        <w:t>Bu projede lisans sınırlamaları nedeniyle uygulanmamış, rapor bölümünde mimari olarak açıklanmıştır (bkz. §9).</w:t>
+        <w:t>Groups ile değiştirmiş olsa da, felaket kurtarma stratejisinde konsept olarak hâlâ önemlidir. Bu projede lisans sınırlamaları nedeniyle uygulanmamış, rapor bölümünde mimari olarak açıklanmıştır (bkz. §9).</w:t>
       </w:r>
     </w:p>
     <w:p>
@@ -1446,15 +1188,7 @@
         <w:spacing w:before="40" w:after="40"/>
       </w:pPr>
       <w:r>
-        <w:t>C:\SQLBackups klasörü (</w:t>
-      </w:r>
-      <w:proofErr w:type="spellStart"/>
-      <w:r>
-        <w:t>script</w:t>
-      </w:r>
-      <w:proofErr w:type="spellEnd"/>
-      <w:r>
-        <w:t xml:space="preserve"> otomatik oluşturuyor)</w:t>
+        <w:t>C:\SQLBackups klasörü (script otomatik oluşturuyor)</w:t>
       </w:r>
     </w:p>
     <w:p>
@@ -1497,23 +1231,43 @@
         <w:spacing w:before="60" w:after="60"/>
         <w:ind w:left="720"/>
       </w:pPr>
-      <w:proofErr w:type="gramStart"/>
       <w:r>
         <w:rPr>
           <w:rFonts w:ascii="Courier New" w:eastAsia="Courier New" w:hAnsi="Courier New" w:cs="Courier New"/>
           <w:sz w:val="18"/>
           <w:szCs w:val="18"/>
         </w:rPr>
-        <w:t>net</w:t>
-      </w:r>
-      <w:proofErr w:type="gramEnd"/>
+        <w:t>net start MSSQLSERVER</w:t>
+      </w:r>
+    </w:p>
+    <w:p>
+      <w:pPr>
+        <w:spacing w:before="60" w:after="60"/>
+        <w:ind w:left="720"/>
+      </w:pPr>
       <w:r>
         <w:rPr>
           <w:rFonts w:ascii="Courier New" w:eastAsia="Courier New" w:hAnsi="Courier New" w:cs="Courier New"/>
           <w:sz w:val="18"/>
           <w:szCs w:val="18"/>
         </w:rPr>
-        <w:t xml:space="preserve"> start MSSQLSERVER</w:t>
+        <w:t>net start SQLSERVERAGENT</w:t>
+      </w:r>
+    </w:p>
+    <w:p>
+      <w:pPr>
+        <w:pStyle w:val="Balk2"/>
+      </w:pPr>
+      <w:r>
+        <w:t>3.3 Script'leri Çalıştırma</w:t>
+      </w:r>
+    </w:p>
+    <w:p>
+      <w:pPr>
+        <w:spacing w:before="60" w:after="80"/>
+      </w:pPr>
+      <w:r>
+        <w:t>Bütün script'ler sql/ klasöründedir. Çalıştırma sırası:</w:t>
       </w:r>
     </w:p>
     <w:p>
@@ -1521,63 +1275,27 @@
         <w:spacing w:before="60" w:after="60"/>
         <w:ind w:left="720"/>
       </w:pPr>
-      <w:proofErr w:type="gramStart"/>
       <w:r>
         <w:rPr>
           <w:rFonts w:ascii="Courier New" w:eastAsia="Courier New" w:hAnsi="Courier New" w:cs="Courier New"/>
           <w:sz w:val="18"/>
           <w:szCs w:val="18"/>
         </w:rPr>
-        <w:t>net</w:t>
-      </w:r>
-      <w:proofErr w:type="gramEnd"/>
+        <w:t>cd Proje2-Yedekleme-Kurtarma/sql</w:t>
+      </w:r>
+    </w:p>
+    <w:p>
+      <w:pPr>
+        <w:spacing w:before="60" w:after="60"/>
+        <w:ind w:left="720"/>
+      </w:pPr>
       <w:r>
         <w:rPr>
           <w:rFonts w:ascii="Courier New" w:eastAsia="Courier New" w:hAnsi="Courier New" w:cs="Courier New"/>
           <w:sz w:val="18"/>
           <w:szCs w:val="18"/>
         </w:rPr>
-        <w:t xml:space="preserve"> start SQLSERVERAGENT</w:t>
-      </w:r>
-    </w:p>
-    <w:p>
-      <w:pPr>
-        <w:pStyle w:val="Balk2"/>
-      </w:pPr>
-      <w:r>
-        <w:t xml:space="preserve">3.3 </w:t>
-      </w:r>
-      <w:proofErr w:type="spellStart"/>
-      <w:r>
-        <w:t>Script'leri</w:t>
-      </w:r>
-      <w:proofErr w:type="spellEnd"/>
-      <w:r>
-        <w:t xml:space="preserve"> Çalıştırma</w:t>
-      </w:r>
-    </w:p>
-    <w:p>
-      <w:pPr>
-        <w:spacing w:before="60" w:after="80"/>
-      </w:pPr>
-      <w:r>
-        <w:t xml:space="preserve">Bütün </w:t>
-      </w:r>
-      <w:proofErr w:type="spellStart"/>
-      <w:r>
-        <w:t>script'ler</w:t>
-      </w:r>
-      <w:proofErr w:type="spellEnd"/>
-      <w:r>
-        <w:t xml:space="preserve"> </w:t>
-      </w:r>
-      <w:proofErr w:type="spellStart"/>
-      <w:r>
-        <w:t>sql</w:t>
-      </w:r>
-      <w:proofErr w:type="spellEnd"/>
-      <w:r>
-        <w:t>/ klasöründedir. Çalıştırma sırası:</w:t>
+        <w:t>sqlcmd -S . -E -C -i 01_setup_database.sql</w:t>
       </w:r>
     </w:p>
     <w:p>
@@ -1585,59 +1303,69 @@
         <w:spacing w:before="60" w:after="60"/>
         <w:ind w:left="720"/>
       </w:pPr>
-      <w:proofErr w:type="gramStart"/>
       <w:r>
         <w:rPr>
           <w:rFonts w:ascii="Courier New" w:eastAsia="Courier New" w:hAnsi="Courier New" w:cs="Courier New"/>
           <w:sz w:val="18"/>
           <w:szCs w:val="18"/>
         </w:rPr>
-        <w:t>cd</w:t>
-      </w:r>
-      <w:proofErr w:type="gramEnd"/>
+        <w:t>sqlcmd -S . -E -C -i 02_full_backup.sql</w:t>
+      </w:r>
+    </w:p>
+    <w:p>
+      <w:pPr>
+        <w:spacing w:before="60" w:after="60"/>
+        <w:ind w:left="720"/>
+      </w:pPr>
       <w:r>
         <w:rPr>
           <w:rFonts w:ascii="Courier New" w:eastAsia="Courier New" w:hAnsi="Courier New" w:cs="Courier New"/>
           <w:sz w:val="18"/>
           <w:szCs w:val="18"/>
         </w:rPr>
-        <w:t xml:space="preserve"> Proje2-Yedekleme-Kurtarma/</w:t>
-      </w:r>
-      <w:proofErr w:type="spellStart"/>
+        <w:t>sqlcmd -S . -E -C -i 03_differential_backup.sql</w:t>
+      </w:r>
+    </w:p>
+    <w:p>
+      <w:pPr>
+        <w:spacing w:before="60" w:after="60"/>
+        <w:ind w:left="720"/>
+      </w:pPr>
       <w:r>
         <w:rPr>
           <w:rFonts w:ascii="Courier New" w:eastAsia="Courier New" w:hAnsi="Courier New" w:cs="Courier New"/>
           <w:sz w:val="18"/>
           <w:szCs w:val="18"/>
         </w:rPr>
-        <w:t>sql</w:t>
-      </w:r>
-      <w:proofErr w:type="spellEnd"/>
+        <w:t>sqlcmd -S . -E -C -i 04_log_backup.sql</w:t>
+      </w:r>
     </w:p>
     <w:p>
       <w:pPr>
         <w:spacing w:before="60" w:after="60"/>
         <w:ind w:left="720"/>
       </w:pPr>
-      <w:proofErr w:type="spellStart"/>
-      <w:proofErr w:type="gramStart"/>
       <w:r>
         <w:rPr>
           <w:rFonts w:ascii="Courier New" w:eastAsia="Courier New" w:hAnsi="Courier New" w:cs="Courier New"/>
           <w:sz w:val="18"/>
           <w:szCs w:val="18"/>
         </w:rPr>
-        <w:t>sqlcmd</w:t>
-      </w:r>
-      <w:proofErr w:type="spellEnd"/>
-      <w:proofErr w:type="gramEnd"/>
+        <w:t># Senaryo testleri için:</w:t>
+      </w:r>
+    </w:p>
+    <w:p>
+      <w:pPr>
+        <w:spacing w:before="60" w:after="60"/>
+        <w:ind w:left="720"/>
+      </w:pPr>
       <w:r>
         <w:rPr>
           <w:rFonts w:ascii="Courier New" w:eastAsia="Courier New" w:hAnsi="Courier New" w:cs="Courier New"/>
           <w:sz w:val="18"/>
           <w:szCs w:val="18"/>
         </w:rPr>
-        <w:t xml:space="preserve"> -S . -E -C -i 01_setup_database.sql</w:t>
+        <w:t>sqlcmd -S . -E -C -i 07_accidental_delete_scenario.sql</w:t>
       </w:r>
     </w:p>
     <w:p>
@@ -1645,25 +1373,27 @@
         <w:spacing w:before="60" w:after="60"/>
         <w:ind w:left="720"/>
       </w:pPr>
-      <w:proofErr w:type="spellStart"/>
-      <w:proofErr w:type="gramStart"/>
       <w:r>
         <w:rPr>
           <w:rFonts w:ascii="Courier New" w:eastAsia="Courier New" w:hAnsi="Courier New" w:cs="Courier New"/>
           <w:sz w:val="18"/>
           <w:szCs w:val="18"/>
         </w:rPr>
-        <w:t>sqlcmd</w:t>
-      </w:r>
-      <w:proofErr w:type="spellEnd"/>
-      <w:proofErr w:type="gramEnd"/>
+        <w:t># Kurtarma:</w:t>
+      </w:r>
+    </w:p>
+    <w:p>
+      <w:pPr>
+        <w:spacing w:before="60" w:after="60"/>
+        <w:ind w:left="720"/>
+      </w:pPr>
       <w:r>
         <w:rPr>
           <w:rFonts w:ascii="Courier New" w:eastAsia="Courier New" w:hAnsi="Courier New" w:cs="Courier New"/>
           <w:sz w:val="18"/>
           <w:szCs w:val="18"/>
         </w:rPr>
-        <w:t xml:space="preserve"> -S . -E -C -i 02_full_backup.sql</w:t>
+        <w:t>sqlcmd -S . -E -C -i 06_restore_point_in_time.sql</w:t>
       </w:r>
     </w:p>
     <w:p>
@@ -1671,25 +1401,27 @@
         <w:spacing w:before="60" w:after="60"/>
         <w:ind w:left="720"/>
       </w:pPr>
-      <w:proofErr w:type="spellStart"/>
-      <w:proofErr w:type="gramStart"/>
       <w:r>
         <w:rPr>
           <w:rFonts w:ascii="Courier New" w:eastAsia="Courier New" w:hAnsi="Courier New" w:cs="Courier New"/>
           <w:sz w:val="18"/>
           <w:szCs w:val="18"/>
         </w:rPr>
-        <w:t>sqlcmd</w:t>
-      </w:r>
-      <w:proofErr w:type="spellEnd"/>
-      <w:proofErr w:type="gramEnd"/>
+        <w:t># Otomasyon:</w:t>
+      </w:r>
+    </w:p>
+    <w:p>
+      <w:pPr>
+        <w:spacing w:before="60" w:after="60"/>
+        <w:ind w:left="720"/>
+      </w:pPr>
       <w:r>
         <w:rPr>
           <w:rFonts w:ascii="Courier New" w:eastAsia="Courier New" w:hAnsi="Courier New" w:cs="Courier New"/>
           <w:sz w:val="18"/>
           <w:szCs w:val="18"/>
         </w:rPr>
-        <w:t xml:space="preserve"> -S . -E -C -i 03_differential_backup.sql</w:t>
+        <w:t>sqlcmd -S . -E -C -i 08_sql_agent_backup_job.sql</w:t>
       </w:r>
     </w:p>
     <w:p>
@@ -1697,185 +1429,27 @@
         <w:spacing w:before="60" w:after="60"/>
         <w:ind w:left="720"/>
       </w:pPr>
-      <w:proofErr w:type="spellStart"/>
-      <w:proofErr w:type="gramStart"/>
       <w:r>
         <w:rPr>
           <w:rFonts w:ascii="Courier New" w:eastAsia="Courier New" w:hAnsi="Courier New" w:cs="Courier New"/>
           <w:sz w:val="18"/>
           <w:szCs w:val="18"/>
         </w:rPr>
-        <w:t>sqlcmd</w:t>
-      </w:r>
-      <w:proofErr w:type="spellEnd"/>
-      <w:proofErr w:type="gramEnd"/>
+        <w:t># Doğrulama:</w:t>
+      </w:r>
+    </w:p>
+    <w:p>
+      <w:pPr>
+        <w:spacing w:before="60" w:after="60"/>
+        <w:ind w:left="720"/>
+      </w:pPr>
       <w:r>
         <w:rPr>
           <w:rFonts w:ascii="Courier New" w:eastAsia="Courier New" w:hAnsi="Courier New" w:cs="Courier New"/>
           <w:sz w:val="18"/>
           <w:szCs w:val="18"/>
         </w:rPr>
-        <w:t xml:space="preserve"> -S . -E -C -i 04_log_backup.sql</w:t>
-      </w:r>
-    </w:p>
-    <w:p>
-      <w:pPr>
-        <w:spacing w:before="60" w:after="60"/>
-        <w:ind w:left="720"/>
-      </w:pPr>
-      <w:r>
-        <w:rPr>
-          <w:rFonts w:ascii="Courier New" w:eastAsia="Courier New" w:hAnsi="Courier New" w:cs="Courier New"/>
-          <w:sz w:val="18"/>
-          <w:szCs w:val="18"/>
-        </w:rPr>
-        <w:t># Senaryo testleri için:</w:t>
-      </w:r>
-    </w:p>
-    <w:p>
-      <w:pPr>
-        <w:spacing w:before="60" w:after="60"/>
-        <w:ind w:left="720"/>
-      </w:pPr>
-      <w:proofErr w:type="spellStart"/>
-      <w:proofErr w:type="gramStart"/>
-      <w:r>
-        <w:rPr>
-          <w:rFonts w:ascii="Courier New" w:eastAsia="Courier New" w:hAnsi="Courier New" w:cs="Courier New"/>
-          <w:sz w:val="18"/>
-          <w:szCs w:val="18"/>
-        </w:rPr>
-        <w:t>sqlcmd</w:t>
-      </w:r>
-      <w:proofErr w:type="spellEnd"/>
-      <w:proofErr w:type="gramEnd"/>
-      <w:r>
-        <w:rPr>
-          <w:rFonts w:ascii="Courier New" w:eastAsia="Courier New" w:hAnsi="Courier New" w:cs="Courier New"/>
-          <w:sz w:val="18"/>
-          <w:szCs w:val="18"/>
-        </w:rPr>
-        <w:t xml:space="preserve"> -S . -E -C -i 07_accidental_delete_scenario.sql</w:t>
-      </w:r>
-    </w:p>
-    <w:p>
-      <w:pPr>
-        <w:spacing w:before="60" w:after="60"/>
-        <w:ind w:left="720"/>
-      </w:pPr>
-      <w:r>
-        <w:rPr>
-          <w:rFonts w:ascii="Courier New" w:eastAsia="Courier New" w:hAnsi="Courier New" w:cs="Courier New"/>
-          <w:sz w:val="18"/>
-          <w:szCs w:val="18"/>
-        </w:rPr>
-        <w:t># Kurtarma:</w:t>
-      </w:r>
-    </w:p>
-    <w:p>
-      <w:pPr>
-        <w:spacing w:before="60" w:after="60"/>
-        <w:ind w:left="720"/>
-      </w:pPr>
-      <w:proofErr w:type="spellStart"/>
-      <w:proofErr w:type="gramStart"/>
-      <w:r>
-        <w:rPr>
-          <w:rFonts w:ascii="Courier New" w:eastAsia="Courier New" w:hAnsi="Courier New" w:cs="Courier New"/>
-          <w:sz w:val="18"/>
-          <w:szCs w:val="18"/>
-        </w:rPr>
-        <w:t>sqlcmd</w:t>
-      </w:r>
-      <w:proofErr w:type="spellEnd"/>
-      <w:proofErr w:type="gramEnd"/>
-      <w:r>
-        <w:rPr>
-          <w:rFonts w:ascii="Courier New" w:eastAsia="Courier New" w:hAnsi="Courier New" w:cs="Courier New"/>
-          <w:sz w:val="18"/>
-          <w:szCs w:val="18"/>
-        </w:rPr>
-        <w:t xml:space="preserve"> -S . -E -C -i 06_restore_point_in_time.sql</w:t>
-      </w:r>
-    </w:p>
-    <w:p>
-      <w:pPr>
-        <w:spacing w:before="60" w:after="60"/>
-        <w:ind w:left="720"/>
-      </w:pPr>
-      <w:r>
-        <w:rPr>
-          <w:rFonts w:ascii="Courier New" w:eastAsia="Courier New" w:hAnsi="Courier New" w:cs="Courier New"/>
-          <w:sz w:val="18"/>
-          <w:szCs w:val="18"/>
-        </w:rPr>
-        <w:t># Otomasyon:</w:t>
-      </w:r>
-    </w:p>
-    <w:p>
-      <w:pPr>
-        <w:spacing w:before="60" w:after="60"/>
-        <w:ind w:left="720"/>
-      </w:pPr>
-      <w:proofErr w:type="spellStart"/>
-      <w:proofErr w:type="gramStart"/>
-      <w:r>
-        <w:rPr>
-          <w:rFonts w:ascii="Courier New" w:eastAsia="Courier New" w:hAnsi="Courier New" w:cs="Courier New"/>
-          <w:sz w:val="18"/>
-          <w:szCs w:val="18"/>
-        </w:rPr>
-        <w:t>sqlcmd</w:t>
-      </w:r>
-      <w:proofErr w:type="spellEnd"/>
-      <w:proofErr w:type="gramEnd"/>
-      <w:r>
-        <w:rPr>
-          <w:rFonts w:ascii="Courier New" w:eastAsia="Courier New" w:hAnsi="Courier New" w:cs="Courier New"/>
-          <w:sz w:val="18"/>
-          <w:szCs w:val="18"/>
-        </w:rPr>
-        <w:t xml:space="preserve"> -S . -E -C -i 08_sql_agent_backup_job.sql</w:t>
-      </w:r>
-    </w:p>
-    <w:p>
-      <w:pPr>
-        <w:spacing w:before="60" w:after="60"/>
-        <w:ind w:left="720"/>
-      </w:pPr>
-      <w:r>
-        <w:rPr>
-          <w:rFonts w:ascii="Courier New" w:eastAsia="Courier New" w:hAnsi="Courier New" w:cs="Courier New"/>
-          <w:sz w:val="18"/>
-          <w:szCs w:val="18"/>
-        </w:rPr>
-        <w:t># Doğrulama:</w:t>
-      </w:r>
-    </w:p>
-    <w:p>
-      <w:pPr>
-        <w:spacing w:before="60" w:after="60"/>
-        <w:ind w:left="720"/>
-      </w:pPr>
-      <w:proofErr w:type="spellStart"/>
-      <w:proofErr w:type="gramStart"/>
-      <w:r>
-        <w:rPr>
-          <w:rFonts w:ascii="Courier New" w:eastAsia="Courier New" w:hAnsi="Courier New" w:cs="Courier New"/>
-          <w:sz w:val="18"/>
-          <w:szCs w:val="18"/>
-        </w:rPr>
-        <w:t>sqlcmd</w:t>
-      </w:r>
-      <w:proofErr w:type="spellEnd"/>
-      <w:proofErr w:type="gramEnd"/>
-      <w:r>
-        <w:rPr>
-          <w:rFonts w:ascii="Courier New" w:eastAsia="Courier New" w:hAnsi="Courier New" w:cs="Courier New"/>
-          <w:sz w:val="18"/>
-          <w:szCs w:val="18"/>
-        </w:rPr>
-        <w:t xml:space="preserve"> -S . -E -C -i 09_verify_backups.sql</w:t>
+        <w:t>sqlcmd -S . -E -C -i 09_verify_backups.sql</w:t>
       </w:r>
     </w:p>
     <w:p>
@@ -1883,28 +1457,15 @@
         <w:pStyle w:val="Balk1"/>
       </w:pPr>
       <w:r>
-        <w:t xml:space="preserve">4. </w:t>
-      </w:r>
-      <w:proofErr w:type="spellStart"/>
-      <w:r>
-        <w:t>Veritabanı</w:t>
-      </w:r>
-      <w:proofErr w:type="spellEnd"/>
-      <w:r>
-        <w:t xml:space="preserve"> Şeması</w:t>
+        <w:t>4. Veritabanı Şeması</w:t>
       </w:r>
     </w:p>
     <w:p>
       <w:pPr>
         <w:spacing w:before="60" w:after="80"/>
       </w:pPr>
-      <w:proofErr w:type="spellStart"/>
-      <w:r>
-        <w:t>OkulDB</w:t>
-      </w:r>
-      <w:proofErr w:type="spellEnd"/>
-      <w:r>
-        <w:t xml:space="preserve"> üç tablolu basit bir okul yönetim şemasıdır:</w:t>
+      <w:r>
+        <w:t>OkulDB üç tablolu basit bir okul yönetim şemasıdır:</w:t>
       </w:r>
     </w:p>
     <w:p>
@@ -1916,39 +1477,8 @@
         </w:numPr>
         <w:spacing w:before="40" w:after="40"/>
       </w:pPr>
-      <w:proofErr w:type="spellStart"/>
-      <w:proofErr w:type="gramStart"/>
-      <w:r>
-        <w:t>Ogrenci</w:t>
-      </w:r>
-      <w:proofErr w:type="spellEnd"/>
-      <w:r>
-        <w:t>(</w:t>
-      </w:r>
-      <w:proofErr w:type="spellStart"/>
-      <w:proofErr w:type="gramEnd"/>
-      <w:r>
-        <w:t>OgrenciID</w:t>
-      </w:r>
-      <w:proofErr w:type="spellEnd"/>
-      <w:r>
-        <w:t xml:space="preserve">, Ad, </w:t>
-      </w:r>
-      <w:proofErr w:type="spellStart"/>
-      <w:r>
-        <w:t>Soyad</w:t>
-      </w:r>
-      <w:proofErr w:type="spellEnd"/>
-      <w:r>
-        <w:t xml:space="preserve">, Numara, Bolum, </w:t>
-      </w:r>
-      <w:proofErr w:type="spellStart"/>
-      <w:r>
-        <w:t>KayitTarihi</w:t>
-      </w:r>
-      <w:proofErr w:type="spellEnd"/>
-      <w:r>
-        <w:t>)</w:t>
+      <w:r>
+        <w:t>Ogrenci(OgrenciID, Ad, Soyad, Numara, Bolum, KayitTarihi)</w:t>
       </w:r>
     </w:p>
     <w:p>
@@ -1960,34 +1490,8 @@
         </w:numPr>
         <w:spacing w:before="40" w:after="40"/>
       </w:pPr>
-      <w:proofErr w:type="gramStart"/>
-      <w:r>
-        <w:t>Ders(</w:t>
-      </w:r>
-      <w:proofErr w:type="spellStart"/>
-      <w:proofErr w:type="gramEnd"/>
-      <w:r>
-        <w:t>DersID</w:t>
-      </w:r>
-      <w:proofErr w:type="spellEnd"/>
-      <w:r>
-        <w:t xml:space="preserve">, </w:t>
-      </w:r>
-      <w:proofErr w:type="spellStart"/>
-      <w:r>
-        <w:t>DersKodu</w:t>
-      </w:r>
-      <w:proofErr w:type="spellEnd"/>
-      <w:r>
-        <w:t xml:space="preserve">, </w:t>
-      </w:r>
-      <w:proofErr w:type="spellStart"/>
-      <w:r>
-        <w:t>DersAdi</w:t>
-      </w:r>
-      <w:proofErr w:type="spellEnd"/>
-      <w:r>
-        <w:t>, Kredi)</w:t>
+      <w:r>
+        <w:t>Ders(DersID, DersKodu, DersAdi, Kredi)</w:t>
       </w:r>
     </w:p>
     <w:p>
@@ -1999,34 +1503,8 @@
         </w:numPr>
         <w:spacing w:before="40" w:after="40"/>
       </w:pPr>
-      <w:proofErr w:type="gramStart"/>
-      <w:r>
-        <w:t>Not(</w:t>
-      </w:r>
-      <w:proofErr w:type="spellStart"/>
-      <w:proofErr w:type="gramEnd"/>
-      <w:r>
-        <w:t>NotID</w:t>
-      </w:r>
-      <w:proofErr w:type="spellEnd"/>
-      <w:r>
-        <w:t xml:space="preserve">, </w:t>
-      </w:r>
-      <w:proofErr w:type="spellStart"/>
-      <w:r>
-        <w:t>OgrenciID</w:t>
-      </w:r>
-      <w:proofErr w:type="spellEnd"/>
-      <w:r>
-        <w:t xml:space="preserve">, </w:t>
-      </w:r>
-      <w:proofErr w:type="spellStart"/>
-      <w:r>
-        <w:t>DersID</w:t>
-      </w:r>
-      <w:proofErr w:type="spellEnd"/>
-      <w:r>
-        <w:t>, Vize, Final, Ortalama)</w:t>
+      <w:r>
+        <w:t>Not(NotID, OgrenciID, DersID, Vize, Final, Ortalama)</w:t>
       </w:r>
     </w:p>
     <w:p>
@@ -2034,23 +1512,7 @@
         <w:spacing w:before="60" w:after="80"/>
       </w:pPr>
       <w:r>
-        <w:t xml:space="preserve">Ortalama sütunu, PERSISTED </w:t>
-      </w:r>
-      <w:proofErr w:type="spellStart"/>
-      <w:r>
-        <w:t>computed</w:t>
-      </w:r>
-      <w:proofErr w:type="spellEnd"/>
-      <w:r>
-        <w:t xml:space="preserve"> </w:t>
-      </w:r>
-      <w:proofErr w:type="spellStart"/>
-      <w:r>
-        <w:t>column</w:t>
-      </w:r>
-      <w:proofErr w:type="spellEnd"/>
-      <w:r>
-        <w:t xml:space="preserve"> olarak tanımlanmıştır (Vize × 0.4 + Final × 0.6). Bu, yedekleme sırasında fiziksel olarak saklanır, restore sonrası hesaplama gerektirmez.</w:t>
+        <w:t>Ortalama sütunu, PERSISTED computed column olarak tanımlanmıştır (Vize × 0.4 + Final × 0.6). Bu, yedekleme sırasında fiziksel olarak saklanır, restore sonrası hesaplama gerektirmez.</w:t>
       </w:r>
     </w:p>
     <w:p>
@@ -2114,67 +1576,8 @@
           <w:sz w:val="20"/>
           <w:szCs w:val="20"/>
         </w:rPr>
-        <w:t xml:space="preserve">Ekran 1 — 01_setup_database.sql çıktısı. </w:t>
-      </w:r>
-      <w:proofErr w:type="spellStart"/>
-      <w:r>
-        <w:rPr>
-          <w:i/>
-          <w:iCs/>
-          <w:sz w:val="20"/>
-          <w:szCs w:val="20"/>
-        </w:rPr>
-        <w:t>Veritabanı</w:t>
-      </w:r>
-      <w:proofErr w:type="spellEnd"/>
-      <w:r>
-        <w:rPr>
-          <w:i/>
-          <w:iCs/>
-          <w:sz w:val="20"/>
-          <w:szCs w:val="20"/>
-        </w:rPr>
-        <w:t xml:space="preserve"> FULL </w:t>
-      </w:r>
-      <w:proofErr w:type="spellStart"/>
-      <w:r>
-        <w:rPr>
-          <w:i/>
-          <w:iCs/>
-          <w:sz w:val="20"/>
-          <w:szCs w:val="20"/>
-        </w:rPr>
-        <w:t>recovery</w:t>
-      </w:r>
-      <w:proofErr w:type="spellEnd"/>
-      <w:r>
-        <w:rPr>
-          <w:i/>
-          <w:iCs/>
-          <w:sz w:val="20"/>
-          <w:szCs w:val="20"/>
-        </w:rPr>
-        <w:t xml:space="preserve"> modelde oluşturuldu, </w:t>
-      </w:r>
-      <w:proofErr w:type="spellStart"/>
-      <w:r>
-        <w:rPr>
-          <w:i/>
-          <w:iCs/>
-          <w:sz w:val="20"/>
-          <w:szCs w:val="20"/>
-        </w:rPr>
-        <w:t>seed</w:t>
-      </w:r>
-      <w:proofErr w:type="spellEnd"/>
-      <w:r>
-        <w:rPr>
-          <w:i/>
-          <w:iCs/>
-          <w:sz w:val="20"/>
-          <w:szCs w:val="20"/>
-        </w:rPr>
-        <w:t xml:space="preserve"> verisi yüklendi.</w:t>
+        <w:lastRenderedPageBreak/>
+        <w:t>Ekran 1 — 01_setup_database.sql çıktısı. Veritabanı FULL recovery modelde oluşturuldu, seed verisi yüklendi.</w:t>
       </w:r>
     </w:p>
     <w:p>
@@ -2238,49 +1641,7 @@
           <w:sz w:val="20"/>
           <w:szCs w:val="20"/>
         </w:rPr>
-        <w:t xml:space="preserve">Ekran 2 — </w:t>
-      </w:r>
-      <w:proofErr w:type="spellStart"/>
-      <w:proofErr w:type="gramStart"/>
-      <w:r>
-        <w:rPr>
-          <w:i/>
-          <w:iCs/>
-          <w:sz w:val="20"/>
-          <w:szCs w:val="20"/>
-        </w:rPr>
-        <w:t>sys.tables</w:t>
-      </w:r>
-      <w:proofErr w:type="spellEnd"/>
-      <w:proofErr w:type="gramEnd"/>
-      <w:r>
-        <w:rPr>
-          <w:i/>
-          <w:iCs/>
-          <w:sz w:val="20"/>
-          <w:szCs w:val="20"/>
-        </w:rPr>
-        <w:t xml:space="preserve"> sorgusu. </w:t>
-      </w:r>
-      <w:proofErr w:type="spellStart"/>
-      <w:r>
-        <w:rPr>
-          <w:i/>
-          <w:iCs/>
-          <w:sz w:val="20"/>
-          <w:szCs w:val="20"/>
-        </w:rPr>
-        <w:t>Ogrenci</w:t>
-      </w:r>
-      <w:proofErr w:type="spellEnd"/>
-      <w:r>
-        <w:rPr>
-          <w:i/>
-          <w:iCs/>
-          <w:sz w:val="20"/>
-          <w:szCs w:val="20"/>
-        </w:rPr>
-        <w:t>, Ders, [Not] tabloları oluşmuş.</w:t>
+        <w:t>Ekran 2 — sys.tables sorgusu. Ogrenci, Ders, [Not] tabloları oluşmuş.</w:t>
       </w:r>
     </w:p>
     <w:p>
@@ -2310,89 +1671,35 @@
           <w:sz w:val="18"/>
           <w:szCs w:val="18"/>
         </w:rPr>
-        <w:t xml:space="preserve">Pazar 02:00   </w:t>
-      </w:r>
-      <w:proofErr w:type="gramStart"/>
+        <w:t>Pazar 02:00     -&gt; FULL (haftalık)</w:t>
+      </w:r>
+    </w:p>
+    <w:p>
+      <w:pPr>
+        <w:spacing w:before="60" w:after="60"/>
+        <w:ind w:left="720"/>
+      </w:pPr>
       <w:r>
         <w:rPr>
           <w:rFonts w:ascii="Courier New" w:eastAsia="Courier New" w:hAnsi="Courier New" w:cs="Courier New"/>
           <w:sz w:val="18"/>
           <w:szCs w:val="18"/>
         </w:rPr>
-        <w:t xml:space="preserve">  -</w:t>
-      </w:r>
-      <w:proofErr w:type="gramEnd"/>
+        <w:t>Pzt-Cmt 02:00   -&gt; DIFFERENTIAL (günlük)</w:t>
+      </w:r>
+    </w:p>
+    <w:p>
+      <w:pPr>
+        <w:spacing w:before="60" w:after="60"/>
+        <w:ind w:left="720"/>
+      </w:pPr>
       <w:r>
         <w:rPr>
           <w:rFonts w:ascii="Courier New" w:eastAsia="Courier New" w:hAnsi="Courier New" w:cs="Courier New"/>
           <w:sz w:val="18"/>
           <w:szCs w:val="18"/>
         </w:rPr>
-        <w:t>&gt; FULL (haftalık)</w:t>
-      </w:r>
-    </w:p>
-    <w:p>
-      <w:pPr>
-        <w:spacing w:before="60" w:after="60"/>
-        <w:ind w:left="720"/>
-      </w:pPr>
-      <w:r>
-        <w:rPr>
-          <w:rFonts w:ascii="Courier New" w:eastAsia="Courier New" w:hAnsi="Courier New" w:cs="Courier New"/>
-          <w:sz w:val="18"/>
-          <w:szCs w:val="18"/>
-        </w:rPr>
-        <w:t xml:space="preserve">Pzt-Cmt 02:00 </w:t>
-      </w:r>
-      <w:proofErr w:type="gramStart"/>
-      <w:r>
-        <w:rPr>
-          <w:rFonts w:ascii="Courier New" w:eastAsia="Courier New" w:hAnsi="Courier New" w:cs="Courier New"/>
-          <w:sz w:val="18"/>
-          <w:szCs w:val="18"/>
-        </w:rPr>
-        <w:t xml:space="preserve">  -</w:t>
-      </w:r>
-      <w:proofErr w:type="gramEnd"/>
-      <w:r>
-        <w:rPr>
-          <w:rFonts w:ascii="Courier New" w:eastAsia="Courier New" w:hAnsi="Courier New" w:cs="Courier New"/>
-          <w:sz w:val="18"/>
-          <w:szCs w:val="18"/>
-        </w:rPr>
-        <w:t>&gt; DIFFERENTIAL (günlük)</w:t>
-      </w:r>
-    </w:p>
-    <w:p>
-      <w:pPr>
-        <w:spacing w:before="60" w:after="60"/>
-        <w:ind w:left="720"/>
-      </w:pPr>
-      <w:r>
-        <w:rPr>
-          <w:rFonts w:ascii="Courier New" w:eastAsia="Courier New" w:hAnsi="Courier New" w:cs="Courier New"/>
-          <w:sz w:val="18"/>
-          <w:szCs w:val="18"/>
-        </w:rPr>
-        <w:t xml:space="preserve">Her 15 </w:t>
-      </w:r>
-      <w:proofErr w:type="gramStart"/>
-      <w:r>
-        <w:rPr>
-          <w:rFonts w:ascii="Courier New" w:eastAsia="Courier New" w:hAnsi="Courier New" w:cs="Courier New"/>
-          <w:sz w:val="18"/>
-          <w:szCs w:val="18"/>
-        </w:rPr>
-        <w:t>dakikada -</w:t>
-      </w:r>
-      <w:proofErr w:type="gramEnd"/>
-      <w:r>
-        <w:rPr>
-          <w:rFonts w:ascii="Courier New" w:eastAsia="Courier New" w:hAnsi="Courier New" w:cs="Courier New"/>
-          <w:sz w:val="18"/>
-          <w:szCs w:val="18"/>
-        </w:rPr>
-        <w:t>&gt; TRANSACTION LOG</w:t>
+        <w:t>Her 15 dakikada -&gt; TRANSACTION LOG</w:t>
       </w:r>
     </w:p>
     <w:p>
@@ -2413,31 +1720,7 @@
         <w:spacing w:before="40" w:after="40"/>
       </w:pPr>
       <w:r>
-        <w:t>RPO (</w:t>
-      </w:r>
-      <w:proofErr w:type="spellStart"/>
-      <w:r>
-        <w:t>Recovery</w:t>
-      </w:r>
-      <w:proofErr w:type="spellEnd"/>
-      <w:r>
-        <w:t xml:space="preserve"> Point </w:t>
-      </w:r>
-      <w:proofErr w:type="spellStart"/>
-      <w:r>
-        <w:t>Objective</w:t>
-      </w:r>
-      <w:proofErr w:type="spellEnd"/>
-      <w:r>
-        <w:t xml:space="preserve">) = 15 dakika: Olası veri kaybı penceresi en fazla bir log </w:t>
-      </w:r>
-      <w:proofErr w:type="spellStart"/>
-      <w:r>
-        <w:t>backup</w:t>
-      </w:r>
-      <w:proofErr w:type="spellEnd"/>
-      <w:r>
-        <w:t xml:space="preserve"> aralığıdır.</w:t>
+        <w:t>RPO (Recovery Point Objective) = 15 dakika: Olası veri kaybı penceresi en fazla bir log backup aralığıdır.</w:t>
       </w:r>
     </w:p>
     <w:p>
@@ -2450,39 +1733,7 @@
         <w:spacing w:before="40" w:after="40"/>
       </w:pPr>
       <w:r>
-        <w:t>RTO (</w:t>
-      </w:r>
-      <w:proofErr w:type="spellStart"/>
-      <w:r>
-        <w:t>Recovery</w:t>
-      </w:r>
-      <w:proofErr w:type="spellEnd"/>
-      <w:r>
-        <w:t xml:space="preserve"> Time </w:t>
-      </w:r>
-      <w:proofErr w:type="spellStart"/>
-      <w:r>
-        <w:t>Objective</w:t>
-      </w:r>
-      <w:proofErr w:type="spellEnd"/>
-      <w:r>
-        <w:t xml:space="preserve">) = dakikalar: Restore = 1 FULL + 1 DIFF + N LOG. </w:t>
-      </w:r>
-      <w:proofErr w:type="spellStart"/>
-      <w:r>
-        <w:t>Diff</w:t>
-      </w:r>
-      <w:proofErr w:type="spellEnd"/>
-      <w:r>
-        <w:t xml:space="preserve"> kullanımı, tüm haftalık </w:t>
-      </w:r>
-      <w:proofErr w:type="spellStart"/>
-      <w:r>
-        <w:t>log'ları</w:t>
-      </w:r>
-      <w:proofErr w:type="spellEnd"/>
-      <w:r>
-        <w:t xml:space="preserve"> sırayla uygulamaktan çok daha hızlıdır.</w:t>
+        <w:t>RTO (Recovery Time Objective) = dakikalar: Restore = 1 FULL + 1 DIFF + N LOG. Diff kullanımı, tüm haftalık log'ları sırayla uygulamaktan çok daha hızlıdır.</w:t>
       </w:r>
     </w:p>
     <w:p>
@@ -2567,78 +1818,7 @@
           <w:sz w:val="20"/>
           <w:szCs w:val="20"/>
         </w:rPr>
-        <w:t xml:space="preserve">Ekran 3 — C:\SQLBackups içinde oluşan .bak (FULL/DIFF) </w:t>
-      </w:r>
-      <w:proofErr w:type="gramStart"/>
-      <w:r>
-        <w:rPr>
-          <w:i/>
-          <w:iCs/>
-          <w:sz w:val="20"/>
-          <w:szCs w:val="20"/>
-        </w:rPr>
-        <w:t>ve .</w:t>
-      </w:r>
-      <w:proofErr w:type="spellStart"/>
-      <w:r>
-        <w:rPr>
-          <w:i/>
-          <w:iCs/>
-          <w:sz w:val="20"/>
-          <w:szCs w:val="20"/>
-        </w:rPr>
-        <w:t>trn</w:t>
-      </w:r>
-      <w:proofErr w:type="spellEnd"/>
-      <w:proofErr w:type="gramEnd"/>
-      <w:r>
-        <w:rPr>
-          <w:i/>
-          <w:iCs/>
-          <w:sz w:val="20"/>
-          <w:szCs w:val="20"/>
-        </w:rPr>
-        <w:t xml:space="preserve"> (LOG) dosyaları. İsimlendirme </w:t>
-      </w:r>
-      <w:proofErr w:type="spellStart"/>
-      <w:r>
-        <w:rPr>
-          <w:i/>
-          <w:iCs/>
-          <w:sz w:val="20"/>
-          <w:szCs w:val="20"/>
-        </w:rPr>
-        <w:t>OkulDB</w:t>
-      </w:r>
-      <w:proofErr w:type="spellEnd"/>
-      <w:r>
-        <w:rPr>
-          <w:i/>
-          <w:iCs/>
-          <w:sz w:val="20"/>
-          <w:szCs w:val="20"/>
-        </w:rPr>
-        <w:t>_&lt;TYPE&gt;_&lt;</w:t>
-      </w:r>
-      <w:proofErr w:type="spellStart"/>
-      <w:r>
-        <w:rPr>
-          <w:i/>
-          <w:iCs/>
-          <w:sz w:val="20"/>
-          <w:szCs w:val="20"/>
-        </w:rPr>
-        <w:t>tarih_saat</w:t>
-      </w:r>
-      <w:proofErr w:type="spellEnd"/>
-      <w:r>
-        <w:rPr>
-          <w:i/>
-          <w:iCs/>
-          <w:sz w:val="20"/>
-          <w:szCs w:val="20"/>
-        </w:rPr>
-        <w:t>&gt;.bak formatında.</w:t>
+        <w:t>Ekran 3 — C:\SQLBackups içinde oluşan .bak (FULL/DIFF) ve .trn (LOG) dosyaları. İsimlendirme OkulDB_&lt;TYPE&gt;_&lt;tarih_saat&gt;.bak formatında.</w:t>
       </w:r>
     </w:p>
     <w:p>
@@ -2646,17 +1826,7 @@
         <w:pStyle w:val="Balk2"/>
       </w:pPr>
       <w:r>
-        <w:t>5.2 Yedek Geçmişi (</w:t>
-      </w:r>
-      <w:proofErr w:type="spellStart"/>
-      <w:proofErr w:type="gramStart"/>
-      <w:r>
-        <w:t>msdb.dbo.backupset</w:t>
-      </w:r>
-      <w:proofErr w:type="spellEnd"/>
-      <w:proofErr w:type="gramEnd"/>
-      <w:r>
-        <w:t>)</w:t>
+        <w:t>5.2 Yedek Geçmişi (msdb.dbo.backupset)</w:t>
       </w:r>
     </w:p>
     <w:p>
@@ -2720,71 +1890,7 @@
           <w:sz w:val="20"/>
           <w:szCs w:val="20"/>
         </w:rPr>
-        <w:t xml:space="preserve">Ekran 4 — </w:t>
-      </w:r>
-      <w:proofErr w:type="spellStart"/>
-      <w:proofErr w:type="gramStart"/>
-      <w:r>
-        <w:rPr>
-          <w:i/>
-          <w:iCs/>
-          <w:sz w:val="20"/>
-          <w:szCs w:val="20"/>
-        </w:rPr>
-        <w:t>msdb.dbo.backupset</w:t>
-      </w:r>
-      <w:proofErr w:type="spellEnd"/>
-      <w:proofErr w:type="gramEnd"/>
-      <w:r>
-        <w:rPr>
-          <w:i/>
-          <w:iCs/>
-          <w:sz w:val="20"/>
-          <w:szCs w:val="20"/>
-        </w:rPr>
-        <w:t xml:space="preserve"> üzerinden alınan son yedekler. </w:t>
-      </w:r>
-      <w:proofErr w:type="spellStart"/>
-      <w:proofErr w:type="gramStart"/>
-      <w:r>
-        <w:rPr>
-          <w:i/>
-          <w:iCs/>
-          <w:sz w:val="20"/>
-          <w:szCs w:val="20"/>
-        </w:rPr>
-        <w:t>type</w:t>
-      </w:r>
-      <w:proofErr w:type="spellEnd"/>
-      <w:proofErr w:type="gramEnd"/>
-      <w:r>
-        <w:rPr>
-          <w:i/>
-          <w:iCs/>
-          <w:sz w:val="20"/>
-          <w:szCs w:val="20"/>
-        </w:rPr>
-        <w:t xml:space="preserve"> sütununda D = FULL, I = DIFF, L = LOG. </w:t>
-      </w:r>
-      <w:proofErr w:type="spellStart"/>
-      <w:r>
-        <w:rPr>
-          <w:i/>
-          <w:iCs/>
-          <w:sz w:val="20"/>
-          <w:szCs w:val="20"/>
-        </w:rPr>
-        <w:t>Compression</w:t>
-      </w:r>
-      <w:proofErr w:type="spellEnd"/>
-      <w:r>
-        <w:rPr>
-          <w:i/>
-          <w:iCs/>
-          <w:sz w:val="20"/>
-          <w:szCs w:val="20"/>
-        </w:rPr>
-        <w:t xml:space="preserve"> etkin olduğu için dosyalar küçük.</w:t>
+        <w:t>Ekran 4 — msdb.dbo.backupset üzerinden alınan son yedekler. type sütununda D = FULL, I = DIFF, L = LOG. Compression etkin olduğu için dosyalar küçük.</w:t>
       </w:r>
     </w:p>
     <w:p>
@@ -2792,6 +1898,7 @@
         <w:pStyle w:val="Balk1"/>
       </w:pPr>
       <w:r>
+        <w:lastRenderedPageBreak/>
         <w:t>6. Senaryo: Yanlışlıkla Silinen Veriyi Geri Getirme</w:t>
       </w:r>
     </w:p>
@@ -2800,7 +1907,6 @@
         <w:pStyle w:val="Balk2"/>
       </w:pPr>
       <w:r>
-        <w:lastRenderedPageBreak/>
         <w:t>6.1 Senaryo Anlatımı</w:t>
       </w:r>
     </w:p>
@@ -2823,27 +1929,7 @@
           <w:sz w:val="18"/>
           <w:szCs w:val="18"/>
         </w:rPr>
-        <w:t xml:space="preserve">DELETE FROM </w:t>
-      </w:r>
-      <w:proofErr w:type="spellStart"/>
-      <w:proofErr w:type="gramStart"/>
-      <w:r>
-        <w:rPr>
-          <w:rFonts w:ascii="Courier New" w:eastAsia="Courier New" w:hAnsi="Courier New" w:cs="Courier New"/>
-          <w:sz w:val="18"/>
-          <w:szCs w:val="18"/>
-        </w:rPr>
-        <w:t>dbo.Ogrenci</w:t>
-      </w:r>
-      <w:proofErr w:type="spellEnd"/>
-      <w:proofErr w:type="gramEnd"/>
-      <w:r>
-        <w:rPr>
-          <w:rFonts w:ascii="Courier New" w:eastAsia="Courier New" w:hAnsi="Courier New" w:cs="Courier New"/>
-          <w:sz w:val="18"/>
-          <w:szCs w:val="18"/>
-        </w:rPr>
-        <w:t>;  -- WHERE unutuldu!</w:t>
+        <w:t>DELETE FROM dbo.Ogrenci;  -- WHERE unutuldu!</w:t>
       </w:r>
     </w:p>
     <w:p>
@@ -2872,15 +1958,7 @@
         <w:spacing w:before="40" w:after="40"/>
       </w:pPr>
       <w:r>
-        <w:t xml:space="preserve">Felaket anını öğren — SQL Server logları veya kullanıcı raporundan (07_accidental_delete_scenario.sql bu anı </w:t>
-      </w:r>
-      <w:proofErr w:type="gramStart"/>
-      <w:r>
-        <w:t>SYSDATETIME(</w:t>
-      </w:r>
-      <w:proofErr w:type="gramEnd"/>
-      <w:r>
-        <w:t>) ile kaydediyor).</w:t>
+        <w:t>Felaket anını öğren — SQL Server logları veya kullanıcı raporundan (07_accidental_delete_scenario.sql bu anı SYSDATETIME() ile kaydediyor).</w:t>
       </w:r>
     </w:p>
     <w:p>
@@ -2893,15 +1971,7 @@
         <w:spacing w:before="40" w:after="40"/>
       </w:pPr>
       <w:r>
-        <w:t xml:space="preserve">Yeni işlemi durdur — Uygulama bağlantıları kesilir: ALTER DATABASE </w:t>
-      </w:r>
-      <w:proofErr w:type="spellStart"/>
-      <w:r>
-        <w:t>OkulDB</w:t>
-      </w:r>
-      <w:proofErr w:type="spellEnd"/>
-      <w:r>
-        <w:t xml:space="preserve"> SET SINGLE_USER WITH ROLLBACK IMMEDIATE;</w:t>
+        <w:t>Yeni işlemi durdur — Uygulama bağlantıları kesilir: ALTER DATABASE OkulDB SET SINGLE_USER WITH ROLLBACK IMMEDIATE;</w:t>
       </w:r>
     </w:p>
     <w:p>
@@ -2913,21 +1983,8 @@
         </w:numPr>
         <w:spacing w:before="40" w:after="40"/>
       </w:pPr>
-      <w:proofErr w:type="spellStart"/>
-      <w:r>
-        <w:t>Tail</w:t>
-      </w:r>
-      <w:proofErr w:type="spellEnd"/>
-      <w:r>
-        <w:t xml:space="preserve">-log </w:t>
-      </w:r>
-      <w:proofErr w:type="spellStart"/>
-      <w:r>
-        <w:t>backup</w:t>
-      </w:r>
-      <w:proofErr w:type="spellEnd"/>
-      <w:r>
-        <w:t xml:space="preserve"> al — Henüz yedeklenmemiş son log kısmını yedekle. Böylece tüm LSN zinciri elde edilir:</w:t>
+      <w:r>
+        <w:t>Tail-log backup al — Henüz yedeklenmemiş son log kısmını yedekle. Böylece tüm LSN zinciri elde edilir:</w:t>
       </w:r>
     </w:p>
     <w:p>
@@ -2941,71 +1998,7 @@
           <w:sz w:val="18"/>
           <w:szCs w:val="18"/>
         </w:rPr>
-        <w:t xml:space="preserve">BACKUP LOG </w:t>
-      </w:r>
-      <w:proofErr w:type="spellStart"/>
-      <w:r>
-        <w:rPr>
-          <w:rFonts w:ascii="Courier New" w:eastAsia="Courier New" w:hAnsi="Courier New" w:cs="Courier New"/>
-          <w:sz w:val="18"/>
-          <w:szCs w:val="18"/>
-        </w:rPr>
-        <w:t>OkulDB</w:t>
-      </w:r>
-      <w:proofErr w:type="spellEnd"/>
-      <w:r>
-        <w:rPr>
-          <w:rFonts w:ascii="Courier New" w:eastAsia="Courier New" w:hAnsi="Courier New" w:cs="Courier New"/>
-          <w:sz w:val="18"/>
-          <w:szCs w:val="18"/>
-        </w:rPr>
-        <w:t xml:space="preserve"> TO DISK = </w:t>
-      </w:r>
-      <w:proofErr w:type="gramStart"/>
-      <w:r>
-        <w:rPr>
-          <w:rFonts w:ascii="Courier New" w:eastAsia="Courier New" w:hAnsi="Courier New" w:cs="Courier New"/>
-          <w:sz w:val="18"/>
-          <w:szCs w:val="18"/>
-        </w:rPr>
-        <w:t>N'C:\</w:t>
-      </w:r>
-      <w:proofErr w:type="spellStart"/>
-      <w:r>
-        <w:rPr>
-          <w:rFonts w:ascii="Courier New" w:eastAsia="Courier New" w:hAnsi="Courier New" w:cs="Courier New"/>
-          <w:sz w:val="18"/>
-          <w:szCs w:val="18"/>
-        </w:rPr>
-        <w:t>SQLBackups</w:t>
-      </w:r>
-      <w:proofErr w:type="spellEnd"/>
-      <w:r>
-        <w:rPr>
-          <w:rFonts w:ascii="Courier New" w:eastAsia="Courier New" w:hAnsi="Courier New" w:cs="Courier New"/>
-          <w:sz w:val="18"/>
-          <w:szCs w:val="18"/>
-        </w:rPr>
-        <w:t>\</w:t>
-      </w:r>
-      <w:proofErr w:type="spellStart"/>
-      <w:r>
-        <w:rPr>
-          <w:rFonts w:ascii="Courier New" w:eastAsia="Courier New" w:hAnsi="Courier New" w:cs="Courier New"/>
-          <w:sz w:val="18"/>
-          <w:szCs w:val="18"/>
-        </w:rPr>
-        <w:t>OkulDB_TAIL.trn</w:t>
-      </w:r>
-      <w:proofErr w:type="spellEnd"/>
-      <w:proofErr w:type="gramEnd"/>
-      <w:r>
-        <w:rPr>
-          <w:rFonts w:ascii="Courier New" w:eastAsia="Courier New" w:hAnsi="Courier New" w:cs="Courier New"/>
-          <w:sz w:val="18"/>
-          <w:szCs w:val="18"/>
-        </w:rPr>
-        <w:t>' WITH NO_TRUNCATE, INIT;</w:t>
+        <w:t>BACKUP LOG OkulDB TO DISK = N'C:\SQLBackups\OkulDB_TAIL.trn' WITH NO_TRUNCATE, INIT;</w:t>
       </w:r>
     </w:p>
     <w:p>
@@ -3031,15 +2024,7 @@
         <w:spacing w:before="40" w:after="40"/>
       </w:pPr>
       <w:r>
-        <w:t xml:space="preserve">FULL + </w:t>
-      </w:r>
-      <w:proofErr w:type="spellStart"/>
-      <w:r>
-        <w:t>DIFF'i</w:t>
-      </w:r>
-      <w:proofErr w:type="spellEnd"/>
-      <w:r>
-        <w:t xml:space="preserve"> NORECOVERY ile yükle.</w:t>
+        <w:t>FULL + DIFF'i NORECOVERY ile yükle.</w:t>
       </w:r>
     </w:p>
     <w:p>
@@ -3065,15 +2050,7 @@
         <w:spacing w:before="40" w:after="40"/>
       </w:pPr>
       <w:r>
-        <w:t xml:space="preserve">Son </w:t>
-      </w:r>
-      <w:proofErr w:type="spellStart"/>
-      <w:r>
-        <w:t>log'u</w:t>
-      </w:r>
-      <w:proofErr w:type="spellEnd"/>
-      <w:r>
-        <w:t xml:space="preserve"> STOPAT = 'felaket anından 1 sn önce' ile uygula.</w:t>
+        <w:t>Son log'u STOPAT = 'felaket anından 1 sn önce' ile uygula.</w:t>
       </w:r>
     </w:p>
     <w:p>
@@ -3086,15 +2063,7 @@
         <w:spacing w:before="40" w:after="40"/>
       </w:pPr>
       <w:r>
-        <w:t xml:space="preserve">RESTORE DATABASE </w:t>
-      </w:r>
-      <w:proofErr w:type="spellStart"/>
-      <w:r>
-        <w:t>OkulDB</w:t>
-      </w:r>
-      <w:proofErr w:type="spellEnd"/>
-      <w:r>
-        <w:t xml:space="preserve"> WITH RECOVERY → DB kullanıma açılır.</w:t>
+        <w:t>RESTORE DATABASE OkulDB WITH RECOVERY → DB kullanıma açılır.</w:t>
       </w:r>
     </w:p>
     <w:p>
@@ -3107,23 +2076,7 @@
         <w:spacing w:before="40" w:after="40"/>
       </w:pPr>
       <w:r>
-        <w:t xml:space="preserve">Doğrula — SELECT </w:t>
-      </w:r>
-      <w:proofErr w:type="gramStart"/>
-      <w:r>
-        <w:t>COUNT(</w:t>
-      </w:r>
-      <w:proofErr w:type="gramEnd"/>
-      <w:r>
-        <w:t xml:space="preserve">*) FROM </w:t>
-      </w:r>
-      <w:proofErr w:type="spellStart"/>
-      <w:r>
-        <w:t>dbo.Ogrenci</w:t>
-      </w:r>
-      <w:proofErr w:type="spellEnd"/>
-      <w:r>
-        <w:t xml:space="preserve"> ile satır sayısı beklenen değerde mi?</w:t>
+        <w:t>Doğrula — SELECT COUNT(*) FROM dbo.Ogrenci ile satır sayısı beklenen değerde mi?</w:t>
       </w:r>
     </w:p>
     <w:p>
@@ -3131,52 +2084,15 @@
         <w:pStyle w:val="Balk2"/>
       </w:pPr>
       <w:r>
-        <w:t xml:space="preserve">6.3 Kritik Not: </w:t>
-      </w:r>
-      <w:proofErr w:type="spellStart"/>
-      <w:r>
-        <w:t>Tail</w:t>
-      </w:r>
-      <w:proofErr w:type="spellEnd"/>
-      <w:r>
-        <w:t xml:space="preserve">-Log </w:t>
-      </w:r>
-      <w:proofErr w:type="spellStart"/>
-      <w:r>
-        <w:t>Backup</w:t>
-      </w:r>
-      <w:proofErr w:type="spellEnd"/>
+        <w:t>6.3 Kritik Not: Tail-Log Backup</w:t>
+      </w:r>
     </w:p>
     <w:p>
       <w:pPr>
         <w:spacing w:before="60" w:after="80"/>
       </w:pPr>
       <w:r>
-        <w:t xml:space="preserve">Felaket sonrası hiçbir işlem yapmadan mutlaka </w:t>
-      </w:r>
-      <w:proofErr w:type="spellStart"/>
-      <w:r>
-        <w:t>tail</w:t>
-      </w:r>
-      <w:proofErr w:type="spellEnd"/>
-      <w:r>
-        <w:t xml:space="preserve">-log </w:t>
-      </w:r>
-      <w:proofErr w:type="spellStart"/>
-      <w:r>
-        <w:t>backup</w:t>
-      </w:r>
-      <w:proofErr w:type="spellEnd"/>
-      <w:r>
-        <w:t xml:space="preserve"> alınmalıdır. Aksi halde felaket anından son log </w:t>
-      </w:r>
-      <w:proofErr w:type="spellStart"/>
-      <w:r>
-        <w:t>backup'ına</w:t>
-      </w:r>
-      <w:proofErr w:type="spellEnd"/>
-      <w:r>
-        <w:t xml:space="preserve"> kadar olan işlemler kaybolur.</w:t>
+        <w:t>Felaket sonrası hiçbir işlem yapmadan mutlaka tail-log backup alınmalıdır. Aksi halde felaket anından son log backup'ına kadar olan işlemler kaybolur.</w:t>
       </w:r>
     </w:p>
     <w:p>
@@ -3192,31 +2108,7 @@
         <w:spacing w:before="60" w:after="80"/>
       </w:pPr>
       <w:r>
-        <w:t xml:space="preserve">Senaryonun tamamı </w:t>
-      </w:r>
-      <w:proofErr w:type="spellStart"/>
-      <w:r>
-        <w:t>tests</w:t>
-      </w:r>
-      <w:proofErr w:type="spellEnd"/>
-      <w:r>
-        <w:t xml:space="preserve">/disaster-recovery-demo.ps1 </w:t>
-      </w:r>
-      <w:proofErr w:type="spellStart"/>
-      <w:r>
-        <w:t>script'i</w:t>
-      </w:r>
-      <w:proofErr w:type="spellEnd"/>
-      <w:r>
-        <w:t xml:space="preserve"> ile tek komutta uçtan uca çalıştırılabilir. Demo sırasıyla: kurulum → FULL → veri + DIFF → veri + LOG → zaman damgası → felaket (DELETE) → </w:t>
-      </w:r>
-      <w:proofErr w:type="spellStart"/>
-      <w:r>
-        <w:t>tail</w:t>
-      </w:r>
-      <w:proofErr w:type="spellEnd"/>
-      <w:r>
-        <w:t>-log → PITR → satır sayısı doğrulaması yapar.</w:t>
+        <w:t>Senaryonun tamamı tests/disaster-recovery-demo.ps1 script'i ile tek komutta uçtan uca çalıştırılabilir. Demo sırasıyla: kurulum → FULL → veri + DIFF → veri + LOG → zaman damgası → felaket (DELETE) → tail-log → PITR → satır sayısı doğrulaması yapar.</w:t>
       </w:r>
     </w:p>
     <w:p>
@@ -3280,47 +2172,7 @@
           <w:sz w:val="20"/>
           <w:szCs w:val="20"/>
         </w:rPr>
-        <w:t xml:space="preserve">Ekran 5 — </w:t>
-      </w:r>
-      <w:proofErr w:type="spellStart"/>
-      <w:r>
-        <w:rPr>
-          <w:i/>
-          <w:iCs/>
-          <w:sz w:val="20"/>
-          <w:szCs w:val="20"/>
-        </w:rPr>
-        <w:t>Demo'nun</w:t>
-      </w:r>
-      <w:proofErr w:type="spellEnd"/>
-      <w:r>
-        <w:rPr>
-          <w:i/>
-          <w:iCs/>
-          <w:sz w:val="20"/>
-          <w:szCs w:val="20"/>
-        </w:rPr>
-        <w:t xml:space="preserve"> ara aşaması: Felaket öncesi </w:t>
-      </w:r>
-      <w:proofErr w:type="spellStart"/>
-      <w:r>
-        <w:rPr>
-          <w:i/>
-          <w:iCs/>
-          <w:sz w:val="20"/>
-          <w:szCs w:val="20"/>
-        </w:rPr>
-        <w:t>Ogrenci</w:t>
-      </w:r>
-      <w:proofErr w:type="spellEnd"/>
-      <w:r>
-        <w:rPr>
-          <w:i/>
-          <w:iCs/>
-          <w:sz w:val="20"/>
-          <w:szCs w:val="20"/>
-        </w:rPr>
-        <w:t xml:space="preserve"> tablosunda 12 satır mevcut ve güvenli an @StopAt olarak kaydedildi.</w:t>
+        <w:t>Ekran 5 — Demo'nun ara aşaması: Felaket öncesi Ogrenci tablosunda 12 satır mevcut ve güvenli an @StopAt olarak kaydedildi.</w:t>
       </w:r>
     </w:p>
     <w:p>
@@ -3466,34 +2318,16 @@
         <w:spacing w:before="60" w:after="80"/>
       </w:pPr>
       <w:r>
-        <w:t xml:space="preserve">08_sql_agent_backup_job.sql iki </w:t>
-      </w:r>
-      <w:proofErr w:type="spellStart"/>
-      <w:r>
-        <w:t>job</w:t>
-      </w:r>
-      <w:proofErr w:type="spellEnd"/>
-      <w:r>
-        <w:t xml:space="preserve"> oluşturur:</w:t>
+        <w:t>08_sql_agent_backup_job.sql iki job oluşturur:</w:t>
       </w:r>
     </w:p>
     <w:p>
       <w:pPr>
         <w:pStyle w:val="Balk2"/>
       </w:pPr>
-      <w:proofErr w:type="spellStart"/>
-      <w:r>
-        <w:t>Job</w:t>
-      </w:r>
-      <w:proofErr w:type="spellEnd"/>
-      <w:r>
-        <w:t xml:space="preserve"> 1: </w:t>
-      </w:r>
-      <w:proofErr w:type="spellStart"/>
-      <w:r>
-        <w:t>OkulDB_Backup_Plan</w:t>
-      </w:r>
-      <w:proofErr w:type="spellEnd"/>
+      <w:r>
+        <w:t>Job 1: OkulDB_Backup_Plan</w:t>
+      </w:r>
     </w:p>
     <w:p>
       <w:pPr>
@@ -3538,13 +2372,8 @@
       <w:pPr>
         <w:pStyle w:val="Balk2"/>
       </w:pPr>
-      <w:proofErr w:type="spellStart"/>
-      <w:r>
-        <w:t>Job</w:t>
-      </w:r>
-      <w:proofErr w:type="spellEnd"/>
-      <w:r>
-        <w:t xml:space="preserve"> 2: OkulDB_Log_Backup_15dk</w:t>
+      <w:r>
+        <w:t>Job 2: OkulDB_Log_Backup_15dk</w:t>
       </w:r>
     </w:p>
     <w:p>
@@ -3570,15 +2399,7 @@
         <w:spacing w:before="40" w:after="40"/>
       </w:pPr>
       <w:r>
-        <w:t xml:space="preserve">Adım: LOG </w:t>
-      </w:r>
-      <w:proofErr w:type="spellStart"/>
-      <w:r>
-        <w:t>backup</w:t>
-      </w:r>
-      <w:proofErr w:type="spellEnd"/>
-      <w:r>
-        <w:t xml:space="preserve"> al.</w:t>
+        <w:t>Adım: LOG backup al.</w:t>
       </w:r>
     </w:p>
     <w:p>
@@ -3594,23 +2415,7 @@
         <w:spacing w:before="60" w:after="80"/>
       </w:pPr>
       <w:r>
-        <w:t xml:space="preserve">Üretim ortamında her </w:t>
-      </w:r>
-      <w:proofErr w:type="spellStart"/>
-      <w:r>
-        <w:t>job'a</w:t>
-      </w:r>
-      <w:proofErr w:type="spellEnd"/>
-      <w:r>
-        <w:t xml:space="preserve"> @notify_level_email ve @notify_email_operator_name parametresi eklenir. Bu, başarısız yedekte sistem yöneticisine e-posta gönderir. Bu projenin </w:t>
-      </w:r>
-      <w:proofErr w:type="spellStart"/>
-      <w:r>
-        <w:t>lab</w:t>
-      </w:r>
-      <w:proofErr w:type="spellEnd"/>
-      <w:r>
-        <w:t xml:space="preserve"> ortamında SMTP yapılandırılmadığı için raporda yalnızca yöntem gösterilmiştir:</w:t>
+        <w:t>Üretim ortamında her job'a @notify_level_email ve @notify_email_operator_name parametresi eklenir. Bu, başarısız yedekte sistem yöneticisine e-posta gönderir. Bu projenin lab ortamında SMTP yapılandırılmadığı için raporda yalnızca yöntem gösterilmiştir:</w:t>
       </w:r>
     </w:p>
     <w:p>
@@ -3624,28 +2429,36 @@
           <w:sz w:val="18"/>
           <w:szCs w:val="18"/>
         </w:rPr>
-        <w:t xml:space="preserve">EXEC </w:t>
-      </w:r>
-      <w:proofErr w:type="spellStart"/>
-      <w:proofErr w:type="gramStart"/>
+        <w:t>EXEC msdb.dbo.sp_update_job</w:t>
+      </w:r>
+    </w:p>
+    <w:p>
+      <w:pPr>
+        <w:spacing w:before="60" w:after="60"/>
+        <w:ind w:left="720"/>
+      </w:pPr>
       <w:r>
         <w:rPr>
           <w:rFonts w:ascii="Courier New" w:eastAsia="Courier New" w:hAnsi="Courier New" w:cs="Courier New"/>
           <w:sz w:val="18"/>
           <w:szCs w:val="18"/>
         </w:rPr>
-        <w:t>msdb.dbo.sp</w:t>
-      </w:r>
-      <w:proofErr w:type="gramEnd"/>
+        <w:t xml:space="preserve">    @job_name = N'OkulDB_Backup_Plan',</w:t>
+      </w:r>
+    </w:p>
+    <w:p>
+      <w:pPr>
+        <w:spacing w:before="60" w:after="60"/>
+        <w:ind w:left="720"/>
+      </w:pPr>
       <w:r>
         <w:rPr>
           <w:rFonts w:ascii="Courier New" w:eastAsia="Courier New" w:hAnsi="Courier New" w:cs="Courier New"/>
           <w:sz w:val="18"/>
           <w:szCs w:val="18"/>
         </w:rPr>
-        <w:t>_update_job</w:t>
-      </w:r>
-      <w:proofErr w:type="spellEnd"/>
+        <w:t xml:space="preserve">    @notify_level_email = 2,   -- 2 = fail, 3 = always</w:t>
+      </w:r>
     </w:p>
     <w:p>
       <w:pPr>
@@ -3658,99 +2471,7 @@
           <w:sz w:val="18"/>
           <w:szCs w:val="18"/>
         </w:rPr>
-        <w:t xml:space="preserve">    @job_name = </w:t>
-      </w:r>
-      <w:proofErr w:type="spellStart"/>
-      <w:r>
-        <w:rPr>
-          <w:rFonts w:ascii="Courier New" w:eastAsia="Courier New" w:hAnsi="Courier New" w:cs="Courier New"/>
-          <w:sz w:val="18"/>
-          <w:szCs w:val="18"/>
-        </w:rPr>
-        <w:t>N'OkulDB_Backup_Plan</w:t>
-      </w:r>
-      <w:proofErr w:type="spellEnd"/>
-      <w:r>
-        <w:rPr>
-          <w:rFonts w:ascii="Courier New" w:eastAsia="Courier New" w:hAnsi="Courier New" w:cs="Courier New"/>
-          <w:sz w:val="18"/>
-          <w:szCs w:val="18"/>
-        </w:rPr>
-        <w:t>',</w:t>
-      </w:r>
-    </w:p>
-    <w:p>
-      <w:pPr>
-        <w:spacing w:before="60" w:after="60"/>
-        <w:ind w:left="720"/>
-      </w:pPr>
-      <w:r>
-        <w:rPr>
-          <w:rFonts w:ascii="Courier New" w:eastAsia="Courier New" w:hAnsi="Courier New" w:cs="Courier New"/>
-          <w:sz w:val="18"/>
-          <w:szCs w:val="18"/>
-        </w:rPr>
-        <w:t xml:space="preserve">    @notify_level_email = </w:t>
-      </w:r>
-      <w:proofErr w:type="gramStart"/>
-      <w:r>
-        <w:rPr>
-          <w:rFonts w:ascii="Courier New" w:eastAsia="Courier New" w:hAnsi="Courier New" w:cs="Courier New"/>
-          <w:sz w:val="18"/>
-          <w:szCs w:val="18"/>
-        </w:rPr>
-        <w:t xml:space="preserve">2,   </w:t>
-      </w:r>
-      <w:proofErr w:type="gramEnd"/>
-      <w:r>
-        <w:rPr>
-          <w:rFonts w:ascii="Courier New" w:eastAsia="Courier New" w:hAnsi="Courier New" w:cs="Courier New"/>
-          <w:sz w:val="18"/>
-          <w:szCs w:val="18"/>
-        </w:rPr>
-        <w:t xml:space="preserve">-- 2 = fail, 3 = </w:t>
-      </w:r>
-      <w:proofErr w:type="spellStart"/>
-      <w:r>
-        <w:rPr>
-          <w:rFonts w:ascii="Courier New" w:eastAsia="Courier New" w:hAnsi="Courier New" w:cs="Courier New"/>
-          <w:sz w:val="18"/>
-          <w:szCs w:val="18"/>
-        </w:rPr>
-        <w:t>always</w:t>
-      </w:r>
-      <w:proofErr w:type="spellEnd"/>
-    </w:p>
-    <w:p>
-      <w:pPr>
-        <w:spacing w:before="60" w:after="60"/>
-        <w:ind w:left="720"/>
-      </w:pPr>
-      <w:r>
-        <w:rPr>
-          <w:rFonts w:ascii="Courier New" w:eastAsia="Courier New" w:hAnsi="Courier New" w:cs="Courier New"/>
-          <w:sz w:val="18"/>
-          <w:szCs w:val="18"/>
-        </w:rPr>
-        <w:t xml:space="preserve">    @notify_email_operator_name = </w:t>
-      </w:r>
-      <w:proofErr w:type="spellStart"/>
-      <w:r>
-        <w:rPr>
-          <w:rFonts w:ascii="Courier New" w:eastAsia="Courier New" w:hAnsi="Courier New" w:cs="Courier New"/>
-          <w:sz w:val="18"/>
-          <w:szCs w:val="18"/>
-        </w:rPr>
-        <w:t>N'DBA_Operator</w:t>
-      </w:r>
-      <w:proofErr w:type="spellEnd"/>
-      <w:r>
-        <w:rPr>
-          <w:rFonts w:ascii="Courier New" w:eastAsia="Courier New" w:hAnsi="Courier New" w:cs="Courier New"/>
-          <w:sz w:val="18"/>
-          <w:szCs w:val="18"/>
-        </w:rPr>
-        <w:t>';</w:t>
+        <w:t xml:space="preserve">    @notify_email_operator_name = N'DBA_Operator';</w:t>
       </w:r>
     </w:p>
     <w:p>
@@ -3778,17 +2499,7 @@
       <w:r>
         <w:lastRenderedPageBreak/>
         <w:br/>
-      </w:r>
-      <w:r>
-        <w:t xml:space="preserve">Oluşturulan </w:t>
-      </w:r>
-      <w:proofErr w:type="spellStart"/>
-      <w:r>
-        <w:t>Job'ların</w:t>
-      </w:r>
-      <w:proofErr w:type="spellEnd"/>
-      <w:r>
-        <w:t xml:space="preserve"> Görünümü</w:t>
+        <w:t>Oluşturulan Job'ların Görünümü</w:t>
       </w:r>
     </w:p>
     <w:p>
@@ -3852,69 +2563,7 @@
           <w:sz w:val="20"/>
           <w:szCs w:val="20"/>
         </w:rPr>
-        <w:t xml:space="preserve">Ekran 8 — 08_sql_agent_backup_job.sql çalıştıktan sonra </w:t>
-      </w:r>
-      <w:proofErr w:type="spellStart"/>
-      <w:proofErr w:type="gramStart"/>
-      <w:r>
-        <w:rPr>
-          <w:i/>
-          <w:iCs/>
-          <w:sz w:val="20"/>
-          <w:szCs w:val="20"/>
-        </w:rPr>
-        <w:t>msdb.dbo.sysjobs</w:t>
-      </w:r>
-      <w:proofErr w:type="spellEnd"/>
-      <w:proofErr w:type="gramEnd"/>
-      <w:r>
-        <w:rPr>
-          <w:i/>
-          <w:iCs/>
-          <w:sz w:val="20"/>
-          <w:szCs w:val="20"/>
-        </w:rPr>
-        <w:t xml:space="preserve"> üzerinde görünen iki </w:t>
-      </w:r>
-      <w:proofErr w:type="spellStart"/>
-      <w:r>
-        <w:rPr>
-          <w:i/>
-          <w:iCs/>
-          <w:sz w:val="20"/>
-          <w:szCs w:val="20"/>
-        </w:rPr>
-        <w:t>job</w:t>
-      </w:r>
-      <w:proofErr w:type="spellEnd"/>
-      <w:r>
-        <w:rPr>
-          <w:i/>
-          <w:iCs/>
-          <w:sz w:val="20"/>
-          <w:szCs w:val="20"/>
-        </w:rPr>
-        <w:t xml:space="preserve">: </w:t>
-      </w:r>
-      <w:proofErr w:type="spellStart"/>
-      <w:r>
-        <w:rPr>
-          <w:i/>
-          <w:iCs/>
-          <w:sz w:val="20"/>
-          <w:szCs w:val="20"/>
-        </w:rPr>
-        <w:t>OkulDB_Backup_Plan</w:t>
-      </w:r>
-      <w:proofErr w:type="spellEnd"/>
-      <w:r>
-        <w:rPr>
-          <w:i/>
-          <w:iCs/>
-          <w:sz w:val="20"/>
-          <w:szCs w:val="20"/>
-        </w:rPr>
-        <w:t xml:space="preserve"> (günlük FULL/DIFF) ve OkulDB_Log_Backup_15dk (her 15 dk LOG).</w:t>
+        <w:t>Ekran 8 — 08_sql_agent_backup_job.sql çalıştıktan sonra msdb.dbo.sysjobs üzerinde görünen iki job: OkulDB_Backup_Plan (günlük FULL/DIFF) ve OkulDB_Log_Backup_15dk (her 15 dk LOG).</w:t>
       </w:r>
     </w:p>
     <w:p>
@@ -3943,15 +2592,7 @@
         <w:spacing w:before="40" w:after="40"/>
       </w:pPr>
       <w:r>
-        <w:t xml:space="preserve">RESTORE VERIFYONLY ... WITH CHECKSUM — yedek dosyasının okunabilirliğini ve sayfa </w:t>
-      </w:r>
-      <w:proofErr w:type="spellStart"/>
-      <w:r>
-        <w:t>checksum'larını</w:t>
-      </w:r>
-      <w:proofErr w:type="spellEnd"/>
-      <w:r>
-        <w:t xml:space="preserve"> kontrol eder (restore etmez).</w:t>
+        <w:t>RESTORE VERIFYONLY ... WITH CHECKSUM — yedek dosyasının okunabilirliğini ve sayfa checksum'larını kontrol eder (restore etmez).</w:t>
       </w:r>
     </w:p>
     <w:p>
@@ -4041,27 +2682,7 @@
           <w:sz w:val="20"/>
           <w:szCs w:val="20"/>
         </w:rPr>
-        <w:t xml:space="preserve">Ekran 9 — 09_verify_backups.sql çıktısı: VERIFYONLY başarılı, HEADERONLY medya bilgilerini listeliyor, test </w:t>
-      </w:r>
-      <w:proofErr w:type="spellStart"/>
-      <w:r>
-        <w:rPr>
-          <w:i/>
-          <w:iCs/>
-          <w:sz w:val="20"/>
-          <w:szCs w:val="20"/>
-        </w:rPr>
-        <w:t>DB'sinde</w:t>
-      </w:r>
-      <w:proofErr w:type="spellEnd"/>
-      <w:r>
-        <w:rPr>
-          <w:i/>
-          <w:iCs/>
-          <w:sz w:val="20"/>
-          <w:szCs w:val="20"/>
-        </w:rPr>
-        <w:t xml:space="preserve"> DBCC CHECKDB temiz.</w:t>
+        <w:t>Ekran 9 — 09_verify_backups.sql çıktısı: VERIFYONLY başarılı, HEADERONLY medya bilgilerini listeliyor, test DB'sinde DBCC CHECKDB temiz.</w:t>
       </w:r>
     </w:p>
     <w:p>
@@ -4069,23 +2690,7 @@
         <w:pStyle w:val="Balk1"/>
       </w:pPr>
       <w:r>
-        <w:t xml:space="preserve">9. Felaket Kurtarma Mimari Notu (Database </w:t>
-      </w:r>
-      <w:proofErr w:type="spellStart"/>
-      <w:r>
-        <w:t>Mirroring</w:t>
-      </w:r>
-      <w:proofErr w:type="spellEnd"/>
-      <w:r>
-        <w:t xml:space="preserve"> / </w:t>
-      </w:r>
-      <w:proofErr w:type="spellStart"/>
-      <w:r>
-        <w:t>Always</w:t>
-      </w:r>
-      <w:proofErr w:type="spellEnd"/>
-      <w:r>
-        <w:t xml:space="preserve"> On)</w:t>
+        <w:t>9. Felaket Kurtarma Mimari Notu (Database Mirroring / Always On)</w:t>
       </w:r>
     </w:p>
     <w:p>
@@ -4105,45 +2710,8 @@
         </w:numPr>
         <w:spacing w:before="40" w:after="40"/>
       </w:pPr>
-      <w:proofErr w:type="spellStart"/>
-      <w:r>
-        <w:t>Always</w:t>
-      </w:r>
-      <w:proofErr w:type="spellEnd"/>
-      <w:r>
-        <w:t xml:space="preserve"> On </w:t>
-      </w:r>
-      <w:proofErr w:type="spellStart"/>
-      <w:r>
-        <w:t>Availability</w:t>
-      </w:r>
-      <w:proofErr w:type="spellEnd"/>
-      <w:r>
-        <w:t xml:space="preserve"> </w:t>
-      </w:r>
-      <w:proofErr w:type="spellStart"/>
-      <w:r>
-        <w:t>Group</w:t>
-      </w:r>
-      <w:proofErr w:type="spellEnd"/>
-      <w:r>
-        <w:t xml:space="preserve"> — </w:t>
-      </w:r>
-      <w:proofErr w:type="spellStart"/>
-      <w:r>
-        <w:t>primary</w:t>
-      </w:r>
-      <w:proofErr w:type="spellEnd"/>
-      <w:r>
-        <w:t xml:space="preserve"> sunucu çökerse </w:t>
-      </w:r>
-      <w:proofErr w:type="spellStart"/>
-      <w:r>
-        <w:t>secondary</w:t>
-      </w:r>
-      <w:proofErr w:type="spellEnd"/>
-      <w:r>
-        <w:t xml:space="preserve"> otomatik devralır (dakikalar değil saniyeler içinde RTO).</w:t>
+      <w:r>
+        <w:t>Always On Availability Group — primary sunucu çökerse secondary otomatik devralır (dakikalar değil saniyeler içinde RTO).</w:t>
       </w:r>
     </w:p>
     <w:p>
@@ -4155,22 +2723,9 @@
         </w:numPr>
         <w:spacing w:before="40" w:after="40"/>
       </w:pPr>
-      <w:proofErr w:type="spellStart"/>
       <w:r>
         <w:lastRenderedPageBreak/>
-        <w:t>Off</w:t>
-      </w:r>
-      <w:proofErr w:type="spellEnd"/>
-      <w:r>
-        <w:t xml:space="preserve">-site yedek — yedek dosyaları farklı bir fiziksel lokasyona (veya bulut: Azure </w:t>
-      </w:r>
-      <w:proofErr w:type="spellStart"/>
-      <w:r>
-        <w:t>Blob</w:t>
-      </w:r>
-      <w:proofErr w:type="spellEnd"/>
-      <w:r>
-        <w:t xml:space="preserve"> Storage) kopyalanır. Aynı binanın yanması halinde yedekler korunur.</w:t>
+        <w:t>Off-site yedek — yedek dosyaları farklı bir fiziksel lokasyona (veya bulut: Azure Blob Storage) kopyalanır. Aynı binanın yanması halinde yedekler korunur.</w:t>
       </w:r>
     </w:p>
     <w:p>
@@ -4211,37 +2766,8 @@
         </w:numPr>
         <w:spacing w:before="40" w:after="40"/>
       </w:pPr>
-      <w:proofErr w:type="spellStart"/>
-      <w:r>
-        <w:t>OkulDB</w:t>
-      </w:r>
-      <w:proofErr w:type="spellEnd"/>
-      <w:r>
-        <w:t xml:space="preserve"> örnek </w:t>
-      </w:r>
-      <w:proofErr w:type="spellStart"/>
-      <w:r>
-        <w:t>veritabanı</w:t>
-      </w:r>
-      <w:proofErr w:type="spellEnd"/>
-      <w:r>
-        <w:t xml:space="preserve"> sıfırdan oluşturulmuş, FULL </w:t>
-      </w:r>
-      <w:proofErr w:type="spellStart"/>
-      <w:r>
-        <w:t>recovery</w:t>
-      </w:r>
-      <w:proofErr w:type="spellEnd"/>
-      <w:r>
-        <w:t xml:space="preserve"> </w:t>
-      </w:r>
-      <w:proofErr w:type="spellStart"/>
-      <w:r>
-        <w:t>model'e</w:t>
-      </w:r>
-      <w:proofErr w:type="spellEnd"/>
-      <w:r>
-        <w:t xml:space="preserve"> alınmıştır.</w:t>
+      <w:r>
+        <w:t>OkulDB örnek veritabanı sıfırdan oluşturulmuş, FULL recovery model'e alınmıştır.</w:t>
       </w:r>
     </w:p>
     <w:p>
@@ -4267,15 +2793,7 @@
         <w:spacing w:before="40" w:after="40"/>
       </w:pPr>
       <w:r>
-        <w:t xml:space="preserve">Yanlışlıkla silme senaryosu canlandırılmış ve </w:t>
-      </w:r>
-      <w:proofErr w:type="spellStart"/>
-      <w:r>
-        <w:t>point</w:t>
-      </w:r>
-      <w:proofErr w:type="spellEnd"/>
-      <w:r>
-        <w:t>-in-time restore ile geri getirilmiştir.</w:t>
+        <w:t>Yanlışlıkla silme senaryosu canlandırılmış ve point-in-time restore ile geri getirilmiştir.</w:t>
       </w:r>
     </w:p>
     <w:p>
@@ -4309,31 +2827,7 @@
         <w:spacing w:before="60" w:after="80"/>
       </w:pPr>
       <w:r>
-        <w:t xml:space="preserve">Tüm adımlar </w:t>
-      </w:r>
-      <w:proofErr w:type="spellStart"/>
-      <w:r>
-        <w:t>sql</w:t>
-      </w:r>
-      <w:proofErr w:type="spellEnd"/>
-      <w:r>
-        <w:t xml:space="preserve">/ klasöründeki </w:t>
-      </w:r>
-      <w:proofErr w:type="spellStart"/>
-      <w:r>
-        <w:t>script'lerde</w:t>
-      </w:r>
-      <w:proofErr w:type="spellEnd"/>
-      <w:r>
-        <w:t xml:space="preserve"> belgelenmiş ve .</w:t>
-      </w:r>
-      <w:proofErr w:type="spellStart"/>
-      <w:r>
-        <w:t>sql</w:t>
-      </w:r>
-      <w:proofErr w:type="spellEnd"/>
-      <w:r>
-        <w:t xml:space="preserve"> dosyalarında yorumlarla açıklanmıştır.</w:t>
+        <w:t>Tüm adımlar sql/ klasöründeki script'lerde belgelenmiş ve .sql dosyalarında yorumlarla açıklanmıştır.</w:t>
       </w:r>
     </w:p>
     <w:p>

</xml_diff>